<commit_message>
casos de uso completados
</commit_message>
<xml_diff>
--- a/UT_7_2026_2027.docx
+++ b/UT_7_2026_2027.docx
@@ -6043,9 +6043,9 @@
       </w:r>
     </w:p>
     <w:p/>
-    <w:bookmarkStart w:id="6" w:name="_Toc49341785" w:displacedByCustomXml="next"/>
+    <w:bookmarkStart w:id="6" w:name="_Toc182500112" w:displacedByCustomXml="next"/>
     <w:bookmarkStart w:id="7" w:name="_Toc182218937" w:displacedByCustomXml="next"/>
-    <w:bookmarkStart w:id="8" w:name="_Toc182500112" w:displacedByCustomXml="next"/>
+    <w:bookmarkStart w:id="8" w:name="_Toc49341785" w:displacedByCustomXml="next"/>
     <w:sdt>
       <w:sdtPr>
         <w:rPr>
@@ -6563,15 +6563,7 @@
           </w:tcPr>
           <w:p>
             <w:r>
-              <w:t xml:space="preserve">Carga y preparación de datos inicial desde los datos existentes en </w:t>
-            </w:r>
-            <w:proofErr w:type="spellStart"/>
-            <w:r>
-              <w:t>Delphos</w:t>
-            </w:r>
-            <w:proofErr w:type="spellEnd"/>
-            <w:r>
-              <w:t>.</w:t>
+              <w:t>Carga y preparación de datos inicial desde los datos existentes en Delphos.</w:t>
             </w:r>
           </w:p>
         </w:tc>
@@ -6857,19 +6849,15 @@
                 <w:r>
                   <w:t xml:space="preserve">IDE para desarrollo </w:t>
                 </w:r>
-                <w:proofErr w:type="gramStart"/>
                 <w:r>
                   <w:t>PHP</w:t>
                 </w:r>
                 <w:r>
                   <w:t xml:space="preserve">  (</w:t>
                 </w:r>
-                <w:proofErr w:type="spellStart"/>
-                <w:proofErr w:type="gramEnd"/>
                 <w:r>
                   <w:t>PhpStorm</w:t>
                 </w:r>
-                <w:proofErr w:type="spellEnd"/>
                 <w:r>
                   <w:t>)</w:t>
                 </w:r>
@@ -6909,7 +6897,6 @@
                 <w:r>
                   <w:t xml:space="preserve">PHP </w:t>
                 </w:r>
-                <w:proofErr w:type="gramStart"/>
                 <w:r>
                   <w:t>7.</w:t>
                 </w:r>
@@ -6917,19 +6904,7 @@
                   <w:t>4.29</w:t>
                 </w:r>
                 <w:r>
-                  <w:t xml:space="preserve">  (</w:t>
-                </w:r>
-                <w:proofErr w:type="gramEnd"/>
-                <w:r>
-                  <w:t xml:space="preserve"> Por compatibilidad con lo ya existente y no usar </w:t>
-                </w:r>
-                <w:proofErr w:type="spellStart"/>
-                <w:r>
-                  <w:t>docker</w:t>
-                </w:r>
-                <w:proofErr w:type="spellEnd"/>
-                <w:r>
-                  <w:t>)</w:t>
+                  <w:t xml:space="preserve">  ( Por compatibilidad con lo ya existente y no usar docker)</w:t>
                 </w:r>
                 <w:r>
                   <w:t xml:space="preserve"> </w:t>
@@ -7002,13 +6977,8 @@
                 <w:tcW w:w="7477" w:type="dxa"/>
               </w:tcPr>
               <w:p>
-                <w:proofErr w:type="spellStart"/>
                 <w:r>
-                  <w:t>MariaDB</w:t>
-                </w:r>
-                <w:proofErr w:type="spellEnd"/>
-                <w:r>
-                  <w:t xml:space="preserve"> </w:t>
+                  <w:t xml:space="preserve">MariaDB </w:t>
                 </w:r>
                 <w:r>
                   <w:t xml:space="preserve"> </w:t>
@@ -7133,13 +7103,8 @@
                 <w:r>
                   <w:t xml:space="preserve">Servidor web con </w:t>
                 </w:r>
-                <w:proofErr w:type="spellStart"/>
                 <w:r>
-                  <w:t>MariaDB</w:t>
-                </w:r>
-                <w:proofErr w:type="spellEnd"/>
-                <w:r>
-                  <w:t xml:space="preserve"> 10.</w:t>
+                  <w:t>MariaDB 10.</w:t>
                 </w:r>
                 <w:r>
                   <w:t>4</w:t>
@@ -7160,15 +7125,7 @@
               </w:tcPr>
               <w:p>
                 <w:r>
-                  <w:t xml:space="preserve">Un usuario de acceso a </w:t>
-                </w:r>
-                <w:proofErr w:type="spellStart"/>
-                <w:r>
-                  <w:t>Mysql</w:t>
-                </w:r>
-                <w:proofErr w:type="spellEnd"/>
-                <w:r>
-                  <w:t xml:space="preserve"> independiente</w:t>
+                  <w:t>Un usuario de acceso a Mysql independiente</w:t>
                 </w:r>
                 <w:r>
                   <w:t xml:space="preserve"> y BBDD propia</w:t>
@@ -7348,11 +7305,9 @@
           <w:r>
             <w:t xml:space="preserve"> la compra del software de desarrollo </w:t>
           </w:r>
-          <w:proofErr w:type="spellStart"/>
           <w:r>
             <w:t>PHPStorm</w:t>
           </w:r>
-          <w:proofErr w:type="spellEnd"/>
           <w:r>
             <w:t xml:space="preserve"> con una licencia profesional.</w:t>
           </w:r>
@@ -7541,7 +7496,7 @@
                 <v:path o:extrusionok="f" gradientshapeok="t" o:connecttype="rect"/>
                 <o:lock v:ext="edit" aspectratio="t"/>
               </v:shapetype>
-              <v:shape id="_x0000_i1025" type="#_x0000_t75" style="width:465.75pt;height:205.3pt">
+              <v:shape id="_x0000_i1025" type="#_x0000_t75" style="width:465.6pt;height:205.2pt">
                 <v:imagedata r:id="rId15" o:title="SecuencaciónFasesProyecto"/>
               </v:shape>
             </w:pict>
@@ -7568,7 +7523,7 @@
           </w:pPr>
           <w:r>
             <w:pict w14:anchorId="5636CC0F">
-              <v:shape id="_x0000_i1026" type="#_x0000_t75" style="width:383.2pt;height:241.8pt">
+              <v:shape id="_x0000_i1026" type="#_x0000_t75" style="width:383.4pt;height:241.8pt">
                 <v:imagedata r:id="rId16" o:title="PlanificaciónRecursosProyectos"/>
               </v:shape>
             </w:pict>
@@ -8004,29 +7959,53 @@
     </w:p>
     <w:p>
       <w:pPr>
-        <w:pBdr>
-          <w:top w:val="single" w:sz="4" w:space="1" w:color="FF0000"/>
-          <w:left w:val="single" w:sz="4" w:space="4" w:color="FF0000"/>
-          <w:bottom w:val="single" w:sz="4" w:space="1" w:color="FF0000"/>
-          <w:right w:val="single" w:sz="4" w:space="4" w:color="FF0000"/>
-        </w:pBdr>
-        <w:rPr>
-          <w:color w:val="FF0000"/>
-        </w:rPr>
-      </w:pPr>
-      <w:proofErr w:type="gramStart"/>
+        <w:jc w:val="center"/>
+      </w:pPr>
       <w:r>
         <w:rPr>
-          <w:color w:val="FF0000"/>
+          <w:noProof/>
         </w:rPr>
-        <w:t>Hacer….</w:t>
-      </w:r>
-      <w:proofErr w:type="gramEnd"/>
-      <w:r>
-        <w:rPr>
-          <w:color w:val="FF0000"/>
-        </w:rPr>
-        <w:t>.</w:t>
+        <w:drawing>
+          <wp:inline distT="0" distB="0" distL="0" distR="0" wp14:anchorId="08DFBD01" wp14:editId="67002A45">
+            <wp:extent cx="3102444" cy="2430780"/>
+            <wp:effectExtent l="0" t="0" r="3175" b="7620"/>
+            <wp:docPr id="997270753" name="Imagen 10"/>
+            <wp:cNvGraphicFramePr>
+              <a:graphicFrameLocks xmlns:a="http://schemas.openxmlformats.org/drawingml/2006/main" noChangeAspect="1"/>
+            </wp:cNvGraphicFramePr>
+            <a:graphic xmlns:a="http://schemas.openxmlformats.org/drawingml/2006/main">
+              <a:graphicData uri="http://schemas.openxmlformats.org/drawingml/2006/picture">
+                <pic:pic xmlns:pic="http://schemas.openxmlformats.org/drawingml/2006/picture">
+                  <pic:nvPicPr>
+                    <pic:cNvPr id="997270753" name="Imagen 997270753"/>
+                    <pic:cNvPicPr/>
+                  </pic:nvPicPr>
+                  <pic:blipFill>
+                    <a:blip r:embed="rId21">
+                      <a:extLst>
+                        <a:ext uri="{28A0092B-C50C-407E-A947-70E740481C1C}">
+                          <a14:useLocalDpi xmlns:a14="http://schemas.microsoft.com/office/drawing/2010/main" val="0"/>
+                        </a:ext>
+                      </a:extLst>
+                    </a:blip>
+                    <a:stretch>
+                      <a:fillRect/>
+                    </a:stretch>
+                  </pic:blipFill>
+                  <pic:spPr>
+                    <a:xfrm>
+                      <a:off x="0" y="0"/>
+                      <a:ext cx="3112984" cy="2439038"/>
+                    </a:xfrm>
+                    <a:prstGeom prst="rect">
+                      <a:avLst/>
+                    </a:prstGeom>
+                  </pic:spPr>
+                </pic:pic>
+              </a:graphicData>
+            </a:graphic>
+          </wp:inline>
+        </w:drawing>
       </w:r>
     </w:p>
     <w:p/>
@@ -8046,29 +8025,53 @@
     </w:p>
     <w:p>
       <w:pPr>
-        <w:pBdr>
-          <w:top w:val="single" w:sz="4" w:space="1" w:color="FF0000"/>
-          <w:left w:val="single" w:sz="4" w:space="4" w:color="FF0000"/>
-          <w:bottom w:val="single" w:sz="4" w:space="1" w:color="FF0000"/>
-          <w:right w:val="single" w:sz="4" w:space="4" w:color="FF0000"/>
-        </w:pBdr>
-        <w:rPr>
-          <w:color w:val="FF0000"/>
-        </w:rPr>
-      </w:pPr>
-      <w:proofErr w:type="gramStart"/>
+        <w:jc w:val="center"/>
+      </w:pPr>
       <w:r>
         <w:rPr>
-          <w:color w:val="FF0000"/>
+          <w:noProof/>
         </w:rPr>
-        <w:t>Hacer….</w:t>
-      </w:r>
-      <w:proofErr w:type="gramEnd"/>
-      <w:r>
-        <w:rPr>
-          <w:color w:val="FF0000"/>
-        </w:rPr>
-        <w:t>.</w:t>
+        <w:drawing>
+          <wp:inline distT="0" distB="0" distL="0" distR="0" wp14:anchorId="5D94AAC0" wp14:editId="660AF178">
+            <wp:extent cx="2867025" cy="1988957"/>
+            <wp:effectExtent l="0" t="0" r="0" b="0"/>
+            <wp:docPr id="1212085345" name="Imagen 11"/>
+            <wp:cNvGraphicFramePr>
+              <a:graphicFrameLocks xmlns:a="http://schemas.openxmlformats.org/drawingml/2006/main" noChangeAspect="1"/>
+            </wp:cNvGraphicFramePr>
+            <a:graphic xmlns:a="http://schemas.openxmlformats.org/drawingml/2006/main">
+              <a:graphicData uri="http://schemas.openxmlformats.org/drawingml/2006/picture">
+                <pic:pic xmlns:pic="http://schemas.openxmlformats.org/drawingml/2006/picture">
+                  <pic:nvPicPr>
+                    <pic:cNvPr id="1212085345" name="Imagen 1212085345"/>
+                    <pic:cNvPicPr/>
+                  </pic:nvPicPr>
+                  <pic:blipFill>
+                    <a:blip r:embed="rId22">
+                      <a:extLst>
+                        <a:ext uri="{28A0092B-C50C-407E-A947-70E740481C1C}">
+                          <a14:useLocalDpi xmlns:a14="http://schemas.microsoft.com/office/drawing/2010/main" val="0"/>
+                        </a:ext>
+                      </a:extLst>
+                    </a:blip>
+                    <a:stretch>
+                      <a:fillRect/>
+                    </a:stretch>
+                  </pic:blipFill>
+                  <pic:spPr>
+                    <a:xfrm>
+                      <a:off x="0" y="0"/>
+                      <a:ext cx="2896858" cy="2009653"/>
+                    </a:xfrm>
+                    <a:prstGeom prst="rect">
+                      <a:avLst/>
+                    </a:prstGeom>
+                  </pic:spPr>
+                </pic:pic>
+              </a:graphicData>
+            </a:graphic>
+          </wp:inline>
+        </w:drawing>
       </w:r>
     </w:p>
     <w:p/>
@@ -8177,6 +8180,7 @@
           </w:tcPr>
           <w:p>
             <w:r>
+              <w:lastRenderedPageBreak/>
               <w:t>Función:</w:t>
             </w:r>
           </w:p>
@@ -8587,35 +8591,7 @@
               <w:rPr>
                 <w:b/>
               </w:rPr>
-              <w:t xml:space="preserve">Cargar la BBDD       </w:t>
-            </w:r>
-            <w:proofErr w:type="spellStart"/>
-            <w:r>
-              <w:rPr>
-                <w:b/>
-              </w:rPr>
-              <w:t>subcaso</w:t>
-            </w:r>
-            <w:proofErr w:type="spellEnd"/>
-            <w:r>
-              <w:rPr>
-                <w:b/>
-              </w:rPr>
-              <w:t xml:space="preserve">: </w:t>
-            </w:r>
-            <w:proofErr w:type="spellStart"/>
-            <w:r>
-              <w:rPr>
-                <w:b/>
-              </w:rPr>
-              <w:t>Gestion</w:t>
-            </w:r>
-            <w:proofErr w:type="spellEnd"/>
-            <w:r>
-              <w:rPr>
-                <w:b/>
-              </w:rPr>
-              <w:t xml:space="preserve"> de errores</w:t>
+              <w:t>Cargar la BBDD       subcaso: Gestion de errores</w:t>
             </w:r>
           </w:p>
         </w:tc>
@@ -8756,19 +8732,11 @@
                 <w:b/>
               </w:rPr>
             </w:pPr>
-            <w:proofErr w:type="spellStart"/>
-            <w:r>
-              <w:rPr>
-                <w:b/>
-              </w:rPr>
-              <w:t>Backup</w:t>
-            </w:r>
-            <w:proofErr w:type="spellEnd"/>
-            <w:r>
-              <w:rPr>
-                <w:b/>
-              </w:rPr>
-              <w:t xml:space="preserve"> de</w:t>
+            <w:r>
+              <w:rPr>
+                <w:b/>
+              </w:rPr>
+              <w:t>Backup de</w:t>
             </w:r>
             <w:r>
               <w:rPr>
@@ -8915,14 +8883,12 @@
                 <w:b/>
               </w:rPr>
             </w:pPr>
-            <w:proofErr w:type="spellStart"/>
             <w:r>
               <w:rPr>
                 <w:b/>
               </w:rPr>
               <w:t>logout</w:t>
             </w:r>
-            <w:proofErr w:type="spellEnd"/>
           </w:p>
         </w:tc>
       </w:tr>
@@ -9364,6 +9330,7 @@
           </w:tcPr>
           <w:p>
             <w:r>
+              <w:lastRenderedPageBreak/>
               <w:t>Función:</w:t>
             </w:r>
           </w:p>
@@ -9734,14 +9701,12 @@
                 <w:b/>
               </w:rPr>
             </w:pPr>
-            <w:proofErr w:type="spellStart"/>
             <w:r>
               <w:rPr>
                 <w:b/>
               </w:rPr>
               <w:t>logout</w:t>
             </w:r>
-            <w:proofErr w:type="spellEnd"/>
           </w:p>
         </w:tc>
       </w:tr>
@@ -9909,7 +9874,6 @@
           </w:tcPr>
           <w:p>
             <w:r>
-              <w:lastRenderedPageBreak/>
               <w:t>Función:</w:t>
             </w:r>
           </w:p>
@@ -10252,10 +10216,19 @@
           </w:tcPr>
           <w:p>
             <w:pPr>
+              <w:tabs>
+                <w:tab w:val="left" w:pos="2520"/>
+              </w:tabs>
               <w:rPr>
                 <w:bCs/>
               </w:rPr>
             </w:pPr>
+            <w:r>
+              <w:rPr>
+                <w:bCs/>
+              </w:rPr>
+              <w:tab/>
+            </w:r>
           </w:p>
         </w:tc>
       </w:tr>
@@ -10280,14 +10253,12 @@
                 <w:b/>
               </w:rPr>
             </w:pPr>
-            <w:proofErr w:type="spellStart"/>
             <w:r>
               <w:rPr>
                 <w:b/>
               </w:rPr>
               <w:t>logout</w:t>
             </w:r>
-            <w:proofErr w:type="spellEnd"/>
           </w:p>
         </w:tc>
       </w:tr>
@@ -10412,7 +10383,7 @@
               <w:rPr>
                 <w:b/>
               </w:rPr>
-              <w:t>Generar informe</w:t>
+              <w:t>Login</w:t>
             </w:r>
           </w:p>
         </w:tc>
@@ -10433,16 +10404,11 @@
             <w:tcW w:w="8606" w:type="dxa"/>
           </w:tcPr>
           <w:p>
-            <w:pPr>
-              <w:rPr>
-                <w:color w:val="FF0000"/>
-              </w:rPr>
-            </w:pPr>
-            <w:r>
-              <w:rPr>
-                <w:color w:val="FF0000"/>
-              </w:rPr>
-              <w:t>Hacer</w:t>
+            <w:r>
+              <w:t>Administrador</w:t>
+            </w:r>
+            <w:r>
+              <w:t xml:space="preserve"> </w:t>
             </w:r>
           </w:p>
         </w:tc>
@@ -10463,16 +10429,574 @@
             <w:tcW w:w="8606" w:type="dxa"/>
           </w:tcPr>
           <w:p>
+            <w:r>
+              <w:t>Da acceso al sistema para poder realizar el resto de acciones.</w:t>
+            </w:r>
+          </w:p>
+        </w:tc>
+      </w:tr>
+      <w:tr>
+        <w:tc>
+          <w:tcPr>
+            <w:tcW w:w="1418" w:type="dxa"/>
+          </w:tcPr>
+          <w:p>
+            <w:r>
+              <w:t>Referencias:</w:t>
+            </w:r>
+          </w:p>
+        </w:tc>
+        <w:tc>
+          <w:tcPr>
+            <w:tcW w:w="8606" w:type="dxa"/>
+          </w:tcPr>
+          <w:p>
+            <w:r>
+              <w:t>RF</w:t>
+            </w:r>
+            <w:r>
+              <w:t>6</w:t>
+            </w:r>
+          </w:p>
+        </w:tc>
+      </w:tr>
+      <w:tr>
+        <w:trPr>
+          <w:trHeight w:val="74"/>
+        </w:trPr>
+        <w:tc>
+          <w:tcPr>
+            <w:tcW w:w="10024" w:type="dxa"/>
+            <w:gridSpan w:val="2"/>
+            <w:shd w:val="clear" w:color="auto" w:fill="D0CECE" w:themeFill="background2" w:themeFillShade="E6"/>
+          </w:tcPr>
+          <w:p>
+            <w:pPr>
+              <w:tabs>
+                <w:tab w:val="left" w:pos="2520"/>
+              </w:tabs>
+              <w:rPr>
+                <w:bCs/>
+              </w:rPr>
+            </w:pPr>
+            <w:r>
+              <w:rPr>
+                <w:bCs/>
+              </w:rPr>
+              <w:tab/>
+            </w:r>
+          </w:p>
+        </w:tc>
+      </w:tr>
+      <w:tr>
+        <w:tc>
+          <w:tcPr>
+            <w:tcW w:w="1418" w:type="dxa"/>
+          </w:tcPr>
+          <w:p>
+            <w:r>
+              <w:t>Nombre</w:t>
+            </w:r>
+          </w:p>
+        </w:tc>
+        <w:tc>
+          <w:tcPr>
+            <w:tcW w:w="8606" w:type="dxa"/>
+          </w:tcPr>
+          <w:p>
+            <w:pPr>
+              <w:rPr>
+                <w:b/>
+              </w:rPr>
+            </w:pPr>
+            <w:r>
+              <w:rPr>
+                <w:b/>
+              </w:rPr>
+              <w:t>Seleccionar fecha inicio</w:t>
+            </w:r>
+          </w:p>
+        </w:tc>
+      </w:tr>
+      <w:tr>
+        <w:tc>
+          <w:tcPr>
+            <w:tcW w:w="1418" w:type="dxa"/>
+          </w:tcPr>
+          <w:p>
+            <w:r>
+              <w:lastRenderedPageBreak/>
+              <w:t>Actores:</w:t>
+            </w:r>
+          </w:p>
+        </w:tc>
+        <w:tc>
+          <w:tcPr>
+            <w:tcW w:w="8606" w:type="dxa"/>
+          </w:tcPr>
+          <w:p>
             <w:pPr>
               <w:rPr>
                 <w:color w:val="FF0000"/>
               </w:rPr>
             </w:pPr>
             <w:r>
+              <w:t>Administrador</w:t>
+            </w:r>
+            <w:r>
+              <w:t xml:space="preserve"> </w:t>
+            </w:r>
+          </w:p>
+        </w:tc>
+      </w:tr>
+      <w:tr>
+        <w:tc>
+          <w:tcPr>
+            <w:tcW w:w="1418" w:type="dxa"/>
+          </w:tcPr>
+          <w:p>
+            <w:r>
+              <w:t>Función:</w:t>
+            </w:r>
+          </w:p>
+        </w:tc>
+        <w:tc>
+          <w:tcPr>
+            <w:tcW w:w="8606" w:type="dxa"/>
+          </w:tcPr>
+          <w:p>
+            <w:pPr>
               <w:rPr>
                 <w:color w:val="FF0000"/>
               </w:rPr>
-              <w:t>Hacer</w:t>
+            </w:pPr>
+            <w:r>
+              <w:t>Selecciona la fecha a partir de la cual se generará el informe de guardias</w:t>
+            </w:r>
+          </w:p>
+        </w:tc>
+      </w:tr>
+      <w:tr>
+        <w:tc>
+          <w:tcPr>
+            <w:tcW w:w="1418" w:type="dxa"/>
+          </w:tcPr>
+          <w:p>
+            <w:r>
+              <w:t>Referencias:</w:t>
+            </w:r>
+          </w:p>
+        </w:tc>
+        <w:tc>
+          <w:tcPr>
+            <w:tcW w:w="8606" w:type="dxa"/>
+          </w:tcPr>
+          <w:p>
+            <w:r>
+              <w:t>RF</w:t>
+            </w:r>
+            <w:r>
+              <w:t>6</w:t>
+            </w:r>
+          </w:p>
+        </w:tc>
+      </w:tr>
+      <w:tr>
+        <w:trPr>
+          <w:trHeight w:val="74"/>
+        </w:trPr>
+        <w:tc>
+          <w:tcPr>
+            <w:tcW w:w="10024" w:type="dxa"/>
+            <w:gridSpan w:val="2"/>
+            <w:shd w:val="clear" w:color="auto" w:fill="D0CECE" w:themeFill="background2" w:themeFillShade="E6"/>
+          </w:tcPr>
+          <w:p>
+            <w:pPr>
+              <w:tabs>
+                <w:tab w:val="left" w:pos="2520"/>
+              </w:tabs>
+              <w:rPr>
+                <w:bCs/>
+              </w:rPr>
+            </w:pPr>
+            <w:r>
+              <w:rPr>
+                <w:bCs/>
+              </w:rPr>
+              <w:tab/>
+            </w:r>
+          </w:p>
+        </w:tc>
+      </w:tr>
+      <w:tr>
+        <w:tc>
+          <w:tcPr>
+            <w:tcW w:w="1418" w:type="dxa"/>
+          </w:tcPr>
+          <w:p>
+            <w:r>
+              <w:t>Nombre</w:t>
+            </w:r>
+          </w:p>
+        </w:tc>
+        <w:tc>
+          <w:tcPr>
+            <w:tcW w:w="8606" w:type="dxa"/>
+          </w:tcPr>
+          <w:p>
+            <w:pPr>
+              <w:rPr>
+                <w:b/>
+              </w:rPr>
+            </w:pPr>
+            <w:r>
+              <w:rPr>
+                <w:b/>
+              </w:rPr>
+              <w:t xml:space="preserve">Seleccionar fecha </w:t>
+            </w:r>
+            <w:r>
+              <w:rPr>
+                <w:b/>
+              </w:rPr>
+              <w:t>fin</w:t>
+            </w:r>
+          </w:p>
+        </w:tc>
+      </w:tr>
+      <w:tr>
+        <w:tc>
+          <w:tcPr>
+            <w:tcW w:w="1418" w:type="dxa"/>
+          </w:tcPr>
+          <w:p>
+            <w:r>
+              <w:t>Actores:</w:t>
+            </w:r>
+          </w:p>
+        </w:tc>
+        <w:tc>
+          <w:tcPr>
+            <w:tcW w:w="8606" w:type="dxa"/>
+          </w:tcPr>
+          <w:p>
+            <w:pPr>
+              <w:rPr>
+                <w:color w:val="FF0000"/>
+              </w:rPr>
+            </w:pPr>
+            <w:r>
+              <w:t>Administrador</w:t>
+            </w:r>
+            <w:r>
+              <w:t xml:space="preserve"> </w:t>
+            </w:r>
+          </w:p>
+        </w:tc>
+      </w:tr>
+      <w:tr>
+        <w:tc>
+          <w:tcPr>
+            <w:tcW w:w="1418" w:type="dxa"/>
+          </w:tcPr>
+          <w:p>
+            <w:r>
+              <w:t>Función:</w:t>
+            </w:r>
+          </w:p>
+        </w:tc>
+        <w:tc>
+          <w:tcPr>
+            <w:tcW w:w="8606" w:type="dxa"/>
+          </w:tcPr>
+          <w:p>
+            <w:pPr>
+              <w:rPr>
+                <w:color w:val="FF0000"/>
+              </w:rPr>
+            </w:pPr>
+            <w:r>
+              <w:t xml:space="preserve">Selecciona la fecha </w:t>
+            </w:r>
+            <w:r>
+              <w:t>límite para el informe de las guardias. Debe ser mayor o igual que la fecha de inicio.</w:t>
+            </w:r>
+          </w:p>
+        </w:tc>
+      </w:tr>
+      <w:tr>
+        <w:tc>
+          <w:tcPr>
+            <w:tcW w:w="1418" w:type="dxa"/>
+          </w:tcPr>
+          <w:p>
+            <w:r>
+              <w:t>Referencias:</w:t>
+            </w:r>
+          </w:p>
+        </w:tc>
+        <w:tc>
+          <w:tcPr>
+            <w:tcW w:w="8606" w:type="dxa"/>
+          </w:tcPr>
+          <w:p>
+            <w:r>
+              <w:t>RF</w:t>
+            </w:r>
+            <w:r>
+              <w:t>6</w:t>
+            </w:r>
+          </w:p>
+        </w:tc>
+      </w:tr>
+      <w:tr>
+        <w:trPr>
+          <w:trHeight w:val="74"/>
+        </w:trPr>
+        <w:tc>
+          <w:tcPr>
+            <w:tcW w:w="10024" w:type="dxa"/>
+            <w:gridSpan w:val="2"/>
+            <w:shd w:val="clear" w:color="auto" w:fill="D0CECE" w:themeFill="background2" w:themeFillShade="E6"/>
+          </w:tcPr>
+          <w:p>
+            <w:pPr>
+              <w:tabs>
+                <w:tab w:val="left" w:pos="2520"/>
+              </w:tabs>
+              <w:rPr>
+                <w:bCs/>
+              </w:rPr>
+            </w:pPr>
+            <w:r>
+              <w:rPr>
+                <w:bCs/>
+              </w:rPr>
+              <w:tab/>
+            </w:r>
+          </w:p>
+        </w:tc>
+      </w:tr>
+      <w:tr>
+        <w:tc>
+          <w:tcPr>
+            <w:tcW w:w="1418" w:type="dxa"/>
+          </w:tcPr>
+          <w:p>
+            <w:r>
+              <w:t>Nombre</w:t>
+            </w:r>
+          </w:p>
+        </w:tc>
+        <w:tc>
+          <w:tcPr>
+            <w:tcW w:w="8606" w:type="dxa"/>
+          </w:tcPr>
+          <w:p>
+            <w:pPr>
+              <w:rPr>
+                <w:b/>
+              </w:rPr>
+            </w:pPr>
+            <w:r>
+              <w:rPr>
+                <w:b/>
+              </w:rPr>
+              <w:t>Mostrar informe</w:t>
+            </w:r>
+          </w:p>
+        </w:tc>
+      </w:tr>
+      <w:tr>
+        <w:tc>
+          <w:tcPr>
+            <w:tcW w:w="1418" w:type="dxa"/>
+          </w:tcPr>
+          <w:p>
+            <w:r>
+              <w:t>Actores:</w:t>
+            </w:r>
+          </w:p>
+        </w:tc>
+        <w:tc>
+          <w:tcPr>
+            <w:tcW w:w="8606" w:type="dxa"/>
+          </w:tcPr>
+          <w:p>
+            <w:pPr>
+              <w:rPr>
+                <w:color w:val="FF0000"/>
+              </w:rPr>
+            </w:pPr>
+            <w:r>
+              <w:t>Administrador</w:t>
+            </w:r>
+            <w:r>
+              <w:t xml:space="preserve"> </w:t>
+            </w:r>
+          </w:p>
+        </w:tc>
+      </w:tr>
+      <w:tr>
+        <w:tc>
+          <w:tcPr>
+            <w:tcW w:w="1418" w:type="dxa"/>
+          </w:tcPr>
+          <w:p>
+            <w:r>
+              <w:t>Función:</w:t>
+            </w:r>
+          </w:p>
+        </w:tc>
+        <w:tc>
+          <w:tcPr>
+            <w:tcW w:w="8606" w:type="dxa"/>
+          </w:tcPr>
+          <w:p>
+            <w:pPr>
+              <w:rPr>
+                <w:color w:val="FF0000"/>
+              </w:rPr>
+            </w:pPr>
+            <w:r>
+              <w:t>Mostrara el informe de las guardias entre las dos fechas seleccionadas. EL informe incluirá la fecha y hora de la guardia, el profesor, el curso y al final cuantas guardias tuvo en total cada profesor dentro del intervalo seleccionado.</w:t>
+            </w:r>
+          </w:p>
+        </w:tc>
+      </w:tr>
+      <w:tr>
+        <w:tc>
+          <w:tcPr>
+            <w:tcW w:w="1418" w:type="dxa"/>
+          </w:tcPr>
+          <w:p>
+            <w:r>
+              <w:t>Referencias:</w:t>
+            </w:r>
+          </w:p>
+        </w:tc>
+        <w:tc>
+          <w:tcPr>
+            <w:tcW w:w="8606" w:type="dxa"/>
+          </w:tcPr>
+          <w:p>
+            <w:r>
+              <w:t>RF</w:t>
+            </w:r>
+            <w:r>
+              <w:t>6</w:t>
+            </w:r>
+          </w:p>
+        </w:tc>
+      </w:tr>
+      <w:tr>
+        <w:trPr>
+          <w:trHeight w:val="74"/>
+        </w:trPr>
+        <w:tc>
+          <w:tcPr>
+            <w:tcW w:w="10024" w:type="dxa"/>
+            <w:gridSpan w:val="2"/>
+            <w:shd w:val="clear" w:color="auto" w:fill="D0CECE" w:themeFill="background2" w:themeFillShade="E6"/>
+          </w:tcPr>
+          <w:p>
+            <w:pPr>
+              <w:tabs>
+                <w:tab w:val="left" w:pos="2520"/>
+              </w:tabs>
+              <w:rPr>
+                <w:bCs/>
+              </w:rPr>
+            </w:pPr>
+            <w:r>
+              <w:rPr>
+                <w:bCs/>
+              </w:rPr>
+              <w:tab/>
+            </w:r>
+          </w:p>
+        </w:tc>
+      </w:tr>
+      <w:tr>
+        <w:tc>
+          <w:tcPr>
+            <w:tcW w:w="1418" w:type="dxa"/>
+          </w:tcPr>
+          <w:p>
+            <w:r>
+              <w:t>Nombre</w:t>
+            </w:r>
+          </w:p>
+        </w:tc>
+        <w:tc>
+          <w:tcPr>
+            <w:tcW w:w="8606" w:type="dxa"/>
+          </w:tcPr>
+          <w:p>
+            <w:pPr>
+              <w:rPr>
+                <w:b/>
+              </w:rPr>
+            </w:pPr>
+            <w:r>
+              <w:rPr>
+                <w:b/>
+              </w:rPr>
+              <w:t>L</w:t>
+            </w:r>
+            <w:r>
+              <w:rPr>
+                <w:b/>
+              </w:rPr>
+              <w:t>ogout</w:t>
+            </w:r>
+          </w:p>
+        </w:tc>
+      </w:tr>
+      <w:tr>
+        <w:tc>
+          <w:tcPr>
+            <w:tcW w:w="1418" w:type="dxa"/>
+          </w:tcPr>
+          <w:p>
+            <w:r>
+              <w:t>Actores:</w:t>
+            </w:r>
+          </w:p>
+        </w:tc>
+        <w:tc>
+          <w:tcPr>
+            <w:tcW w:w="8606" w:type="dxa"/>
+          </w:tcPr>
+          <w:p>
+            <w:r>
+              <w:t>Administrador</w:t>
+            </w:r>
+            <w:r>
+              <w:t xml:space="preserve"> </w:t>
+            </w:r>
+          </w:p>
+        </w:tc>
+      </w:tr>
+      <w:tr>
+        <w:tc>
+          <w:tcPr>
+            <w:tcW w:w="1418" w:type="dxa"/>
+          </w:tcPr>
+          <w:p>
+            <w:r>
+              <w:t>Función:</w:t>
+            </w:r>
+          </w:p>
+        </w:tc>
+        <w:tc>
+          <w:tcPr>
+            <w:tcW w:w="8606" w:type="dxa"/>
+          </w:tcPr>
+          <w:p>
+            <w:r>
+              <w:t>Salida del sistema.</w:t>
             </w:r>
           </w:p>
         </w:tc>
@@ -10555,7 +11079,7 @@
               <w:rPr>
                 <w:b/>
               </w:rPr>
-              <w:t>Generar informe</w:t>
+              <w:t>Login</w:t>
             </w:r>
           </w:p>
         </w:tc>
@@ -10576,16 +11100,11 @@
             <w:tcW w:w="8606" w:type="dxa"/>
           </w:tcPr>
           <w:p>
-            <w:pPr>
-              <w:rPr>
-                <w:color w:val="FF0000"/>
-              </w:rPr>
-            </w:pPr>
-            <w:r>
-              <w:rPr>
-                <w:color w:val="FF0000"/>
-              </w:rPr>
-              <w:t>Hacer</w:t>
+            <w:r>
+              <w:t>Administrador</w:t>
+            </w:r>
+            <w:r>
+              <w:t xml:space="preserve"> </w:t>
             </w:r>
           </w:p>
         </w:tc>
@@ -10606,16 +11125,294 @@
             <w:tcW w:w="8606" w:type="dxa"/>
           </w:tcPr>
           <w:p>
+            <w:r>
+              <w:t>Da acceso al sistema para poder realizar el resto de acciones.</w:t>
+            </w:r>
+          </w:p>
+        </w:tc>
+      </w:tr>
+      <w:tr>
+        <w:tc>
+          <w:tcPr>
+            <w:tcW w:w="1418" w:type="dxa"/>
+          </w:tcPr>
+          <w:p>
+            <w:r>
+              <w:t>Referencias:</w:t>
+            </w:r>
+          </w:p>
+        </w:tc>
+        <w:tc>
+          <w:tcPr>
+            <w:tcW w:w="8606" w:type="dxa"/>
+          </w:tcPr>
+          <w:p>
+            <w:r>
+              <w:t>RF</w:t>
+            </w:r>
+            <w:r>
+              <w:t>7</w:t>
+            </w:r>
+          </w:p>
+        </w:tc>
+      </w:tr>
+      <w:tr>
+        <w:trPr>
+          <w:trHeight w:val="74"/>
+        </w:trPr>
+        <w:tc>
+          <w:tcPr>
+            <w:tcW w:w="10024" w:type="dxa"/>
+            <w:gridSpan w:val="2"/>
+            <w:shd w:val="clear" w:color="auto" w:fill="D0CECE" w:themeFill="background2" w:themeFillShade="E6"/>
+          </w:tcPr>
+          <w:p>
+            <w:pPr>
+              <w:tabs>
+                <w:tab w:val="left" w:pos="2520"/>
+              </w:tabs>
+              <w:rPr>
+                <w:bCs/>
+              </w:rPr>
+            </w:pPr>
+            <w:r>
+              <w:rPr>
+                <w:bCs/>
+              </w:rPr>
+              <w:tab/>
+            </w:r>
+          </w:p>
+        </w:tc>
+      </w:tr>
+      <w:tr>
+        <w:tc>
+          <w:tcPr>
+            <w:tcW w:w="1418" w:type="dxa"/>
+          </w:tcPr>
+          <w:p>
+            <w:r>
+              <w:t>Nombre</w:t>
+            </w:r>
+          </w:p>
+        </w:tc>
+        <w:tc>
+          <w:tcPr>
+            <w:tcW w:w="8606" w:type="dxa"/>
+          </w:tcPr>
+          <w:p>
+            <w:pPr>
+              <w:rPr>
+                <w:b/>
+              </w:rPr>
+            </w:pPr>
+            <w:r>
+              <w:rPr>
+                <w:b/>
+              </w:rPr>
+              <w:t>Mostrar listado</w:t>
+            </w:r>
+          </w:p>
+        </w:tc>
+      </w:tr>
+      <w:tr>
+        <w:tc>
+          <w:tcPr>
+            <w:tcW w:w="1418" w:type="dxa"/>
+          </w:tcPr>
+          <w:p>
+            <w:r>
+              <w:t>Actores:</w:t>
+            </w:r>
+          </w:p>
+        </w:tc>
+        <w:tc>
+          <w:tcPr>
+            <w:tcW w:w="8606" w:type="dxa"/>
+          </w:tcPr>
+          <w:p>
             <w:pPr>
               <w:rPr>
                 <w:color w:val="FF0000"/>
               </w:rPr>
             </w:pPr>
             <w:r>
+              <w:t>Administrador</w:t>
+            </w:r>
+            <w:r>
+              <w:t xml:space="preserve"> </w:t>
+            </w:r>
+          </w:p>
+        </w:tc>
+      </w:tr>
+      <w:tr>
+        <w:tc>
+          <w:tcPr>
+            <w:tcW w:w="1418" w:type="dxa"/>
+          </w:tcPr>
+          <w:p>
+            <w:r>
+              <w:t>Función:</w:t>
+            </w:r>
+          </w:p>
+        </w:tc>
+        <w:tc>
+          <w:tcPr>
+            <w:tcW w:w="8606" w:type="dxa"/>
+          </w:tcPr>
+          <w:p>
+            <w:pPr>
               <w:rPr>
                 <w:color w:val="FF0000"/>
               </w:rPr>
-              <w:t>Hacer</w:t>
+            </w:pPr>
+            <w:r>
+              <w:t>Muestra el listado de los usuarios que pueden acceder al sistema. Divide a los usuarios por roles (administrador / profesor) y presenta todos los datos de cada uno sin su clave de acceso.</w:t>
+            </w:r>
+          </w:p>
+        </w:tc>
+      </w:tr>
+      <w:tr>
+        <w:tc>
+          <w:tcPr>
+            <w:tcW w:w="1418" w:type="dxa"/>
+          </w:tcPr>
+          <w:p>
+            <w:r>
+              <w:t>Referencias:</w:t>
+            </w:r>
+          </w:p>
+        </w:tc>
+        <w:tc>
+          <w:tcPr>
+            <w:tcW w:w="8606" w:type="dxa"/>
+          </w:tcPr>
+          <w:p>
+            <w:r>
+              <w:t>RF</w:t>
+            </w:r>
+            <w:r>
+              <w:t>7</w:t>
+            </w:r>
+          </w:p>
+        </w:tc>
+      </w:tr>
+      <w:tr>
+        <w:trPr>
+          <w:trHeight w:val="74"/>
+        </w:trPr>
+        <w:tc>
+          <w:tcPr>
+            <w:tcW w:w="10024" w:type="dxa"/>
+            <w:gridSpan w:val="2"/>
+            <w:shd w:val="clear" w:color="auto" w:fill="D0CECE" w:themeFill="background2" w:themeFillShade="E6"/>
+          </w:tcPr>
+          <w:p>
+            <w:pPr>
+              <w:tabs>
+                <w:tab w:val="left" w:pos="2520"/>
+              </w:tabs>
+              <w:rPr>
+                <w:bCs/>
+              </w:rPr>
+            </w:pPr>
+            <w:r>
+              <w:rPr>
+                <w:bCs/>
+              </w:rPr>
+              <w:tab/>
+            </w:r>
+          </w:p>
+        </w:tc>
+      </w:tr>
+      <w:tr>
+        <w:tc>
+          <w:tcPr>
+            <w:tcW w:w="1418" w:type="dxa"/>
+          </w:tcPr>
+          <w:p>
+            <w:r>
+              <w:t>Nombre</w:t>
+            </w:r>
+          </w:p>
+        </w:tc>
+        <w:tc>
+          <w:tcPr>
+            <w:tcW w:w="8606" w:type="dxa"/>
+          </w:tcPr>
+          <w:p>
+            <w:pPr>
+              <w:rPr>
+                <w:b/>
+              </w:rPr>
+            </w:pPr>
+            <w:r>
+              <w:rPr>
+                <w:b/>
+              </w:rPr>
+              <w:t>L</w:t>
+            </w:r>
+            <w:r>
+              <w:rPr>
+                <w:b/>
+              </w:rPr>
+              <w:t>ogout</w:t>
+            </w:r>
+          </w:p>
+        </w:tc>
+      </w:tr>
+      <w:tr>
+        <w:tc>
+          <w:tcPr>
+            <w:tcW w:w="1418" w:type="dxa"/>
+          </w:tcPr>
+          <w:p>
+            <w:r>
+              <w:t>Actores:</w:t>
+            </w:r>
+          </w:p>
+        </w:tc>
+        <w:tc>
+          <w:tcPr>
+            <w:tcW w:w="8606" w:type="dxa"/>
+          </w:tcPr>
+          <w:p>
+            <w:pPr>
+              <w:rPr>
+                <w:color w:val="FF0000"/>
+              </w:rPr>
+            </w:pPr>
+            <w:r>
+              <w:t>Administrador</w:t>
+            </w:r>
+            <w:r>
+              <w:t xml:space="preserve"> </w:t>
+            </w:r>
+          </w:p>
+        </w:tc>
+      </w:tr>
+      <w:tr>
+        <w:tc>
+          <w:tcPr>
+            <w:tcW w:w="1418" w:type="dxa"/>
+          </w:tcPr>
+          <w:p>
+            <w:r>
+              <w:t>Función:</w:t>
+            </w:r>
+          </w:p>
+        </w:tc>
+        <w:tc>
+          <w:tcPr>
+            <w:tcW w:w="8606" w:type="dxa"/>
+          </w:tcPr>
+          <w:p>
+            <w:pPr>
+              <w:rPr>
+                <w:color w:val="FF0000"/>
+              </w:rPr>
+            </w:pPr>
+            <w:r>
+              <w:t>Salida del sistema.</w:t>
             </w:r>
           </w:p>
         </w:tc>
@@ -10695,7 +11492,7 @@
                     </pic:cNvPicPr>
                   </pic:nvPicPr>
                   <pic:blipFill>
-                    <a:blip r:embed="rId21">
+                    <a:blip r:embed="rId23">
                       <a:extLst>
                         <a:ext uri="{28A0092B-C50C-407E-A947-70E740481C1C}">
                           <a14:useLocalDpi xmlns:a14="http://schemas.microsoft.com/office/drawing/2010/main" val="0"/>
@@ -10798,7 +11595,7 @@
                     </pic:cNvPicPr>
                   </pic:nvPicPr>
                   <pic:blipFill>
-                    <a:blip r:embed="rId22">
+                    <a:blip r:embed="rId24">
                       <a:extLst>
                         <a:ext uri="{28A0092B-C50C-407E-A947-70E740481C1C}">
                           <a14:useLocalDpi xmlns:a14="http://schemas.microsoft.com/office/drawing/2010/main" val="0"/>
@@ -10891,8 +11688,8 @@
       </w:pPr>
       <w:r>
         <w:pict w14:anchorId="119133E6">
-          <v:shape id="_x0000_i1027" type="#_x0000_t75" style="width:253pt;height:468.95pt">
-            <v:imagedata r:id="rId23" o:title="DA_Login"/>
+          <v:shape id="_x0000_i1027" type="#_x0000_t75" style="width:253.2pt;height:469.2pt">
+            <v:imagedata r:id="rId25" o:title="DA_Login"/>
           </v:shape>
         </w:pict>
       </w:r>
@@ -10922,7 +11719,7 @@
                     </pic:cNvPicPr>
                   </pic:nvPicPr>
                   <pic:blipFill>
-                    <a:blip r:embed="rId24">
+                    <a:blip r:embed="rId26">
                       <a:extLst>
                         <a:ext uri="{28A0092B-C50C-407E-A947-70E740481C1C}">
                           <a14:useLocalDpi xmlns:a14="http://schemas.microsoft.com/office/drawing/2010/main" val="0"/>
@@ -10977,8 +11774,8 @@
       <w:pPr>
         <w:pStyle w:val="Ttulo3"/>
         <w:sectPr>
-          <w:headerReference w:type="default" r:id="rId25"/>
-          <w:footerReference w:type="default" r:id="rId26"/>
+          <w:headerReference w:type="default" r:id="rId27"/>
+          <w:footerReference w:type="default" r:id="rId28"/>
           <w:pgSz w:w="11906" w:h="16838" w:code="9"/>
           <w:pgMar w:top="1291" w:right="936" w:bottom="720" w:left="936" w:header="0" w:footer="289" w:gutter="0"/>
           <w:pgNumType w:start="1"/>
@@ -11040,7 +11837,7 @@
                     </pic:cNvPicPr>
                   </pic:nvPicPr>
                   <pic:blipFill>
-                    <a:blip r:embed="rId27">
+                    <a:blip r:embed="rId29">
                       <a:extLst>
                         <a:ext uri="{28A0092B-C50C-407E-A947-70E740481C1C}">
                           <a14:useLocalDpi xmlns:a14="http://schemas.microsoft.com/office/drawing/2010/main" val="0"/>
@@ -11110,7 +11907,7 @@
                     </pic:cNvPicPr>
                   </pic:nvPicPr>
                   <pic:blipFill>
-                    <a:blip r:embed="rId28">
+                    <a:blip r:embed="rId30">
                       <a:extLst>
                         <a:ext uri="{28A0092B-C50C-407E-A947-70E740481C1C}">
                           <a14:useLocalDpi xmlns:a14="http://schemas.microsoft.com/office/drawing/2010/main" val="0"/>
@@ -11225,7 +12022,7 @@
                     </pic:cNvPicPr>
                   </pic:nvPicPr>
                   <pic:blipFill>
-                    <a:blip r:embed="rId29">
+                    <a:blip r:embed="rId31">
                       <a:extLst>
                         <a:ext uri="{28A0092B-C50C-407E-A947-70E740481C1C}">
                           <a14:useLocalDpi xmlns:a14="http://schemas.microsoft.com/office/drawing/2010/main" val="0"/>
@@ -11299,7 +12096,7 @@
                     </pic:cNvPicPr>
                   </pic:nvPicPr>
                   <pic:blipFill>
-                    <a:blip r:embed="rId30">
+                    <a:blip r:embed="rId32">
                       <a:extLst>
                         <a:ext uri="{28A0092B-C50C-407E-A947-70E740481C1C}">
                           <a14:useLocalDpi xmlns:a14="http://schemas.microsoft.com/office/drawing/2010/main" val="0"/>
@@ -11380,19 +12177,11 @@
           <w:color w:val="FF0000"/>
         </w:rPr>
       </w:pPr>
-      <w:proofErr w:type="gramStart"/>
       <w:r>
         <w:rPr>
           <w:color w:val="FF0000"/>
         </w:rPr>
-        <w:t>Hacer….</w:t>
-      </w:r>
-      <w:proofErr w:type="gramEnd"/>
-      <w:r>
-        <w:rPr>
-          <w:color w:val="FF0000"/>
-        </w:rPr>
-        <w:t>.</w:t>
+        <w:t>Hacer…..</w:t>
       </w:r>
     </w:p>
     <w:p>
@@ -11423,19 +12212,11 @@
           <w:color w:val="FF0000"/>
         </w:rPr>
       </w:pPr>
-      <w:proofErr w:type="gramStart"/>
       <w:r>
         <w:rPr>
           <w:color w:val="FF0000"/>
         </w:rPr>
-        <w:t>Hacer….</w:t>
-      </w:r>
-      <w:proofErr w:type="gramEnd"/>
-      <w:r>
-        <w:rPr>
-          <w:color w:val="FF0000"/>
-        </w:rPr>
-        <w:t>.</w:t>
+        <w:t>Hacer…..</w:t>
       </w:r>
     </w:p>
     <w:p>
@@ -11515,7 +12296,7 @@
                     </pic:cNvPicPr>
                   </pic:nvPicPr>
                   <pic:blipFill>
-                    <a:blip r:embed="rId31">
+                    <a:blip r:embed="rId33">
                       <a:extLst>
                         <a:ext uri="{28A0092B-C50C-407E-A947-70E740481C1C}">
                           <a14:useLocalDpi xmlns:a14="http://schemas.microsoft.com/office/drawing/2010/main" val="0"/>
@@ -11613,34 +12394,20 @@
       <w:r>
         <w:t xml:space="preserve">Profesores: </w:t>
       </w:r>
-      <w:proofErr w:type="spellStart"/>
       <w:r>
         <w:rPr>
           <w:u w:val="single"/>
         </w:rPr>
-        <w:t>id_</w:t>
-      </w:r>
-      <w:proofErr w:type="gramStart"/>
-      <w:r>
-        <w:rPr>
-          <w:u w:val="single"/>
-        </w:rPr>
-        <w:t>usuario</w:t>
+        <w:t>id_usuario</w:t>
       </w:r>
       <w:r>
-        <w:t>,nombre</w:t>
-      </w:r>
-      <w:proofErr w:type="spellEnd"/>
-      <w:proofErr w:type="gramEnd"/>
-      <w:r>
-        <w:t>, apellidos, clave</w:t>
+        <w:t>,nombre, apellidos, clave</w:t>
       </w:r>
     </w:p>
     <w:p>
       <w:r>
         <w:t xml:space="preserve">Guardias: </w:t>
       </w:r>
-      <w:proofErr w:type="spellStart"/>
       <w:r>
         <w:rPr>
           <w:u w:val="single"/>
@@ -11653,53 +12420,14 @@
         </w:rPr>
         <w:t>o</w:t>
       </w:r>
-      <w:proofErr w:type="spellEnd"/>
       <w:r>
         <w:rPr>
           <w:u w:val="single"/>
         </w:rPr>
-        <w:t xml:space="preserve">, </w:t>
-      </w:r>
-      <w:proofErr w:type="spellStart"/>
-      <w:r>
-        <w:rPr>
-          <w:u w:val="single"/>
-        </w:rPr>
-        <w:t>dia</w:t>
-      </w:r>
-      <w:proofErr w:type="spellEnd"/>
-      <w:r>
-        <w:rPr>
-          <w:u w:val="single"/>
-        </w:rPr>
-        <w:t>, hora</w:t>
+        <w:t>, dia, hora</w:t>
       </w:r>
       <w:r>
-        <w:t xml:space="preserve">, </w:t>
-      </w:r>
-      <w:proofErr w:type="gramStart"/>
-      <w:r>
-        <w:t>curso(</w:t>
-      </w:r>
-      <w:proofErr w:type="gramEnd"/>
-      <w:r>
-        <w:t xml:space="preserve">FK), </w:t>
-      </w:r>
-      <w:proofErr w:type="gramStart"/>
-      <w:r>
-        <w:t>tarea(</w:t>
-      </w:r>
-      <w:proofErr w:type="gramEnd"/>
-      <w:r>
-        <w:t xml:space="preserve">FK), </w:t>
-      </w:r>
-      <w:proofErr w:type="gramStart"/>
-      <w:r>
-        <w:t>clase(</w:t>
-      </w:r>
-      <w:proofErr w:type="gramEnd"/>
-      <w:r>
-        <w:t>FK), tarea</w:t>
+        <w:t>, curso(FK), tarea(FK), clase(FK), tarea</w:t>
       </w:r>
       <w:r>
         <w:t>, ficheros</w:t>
@@ -11787,14 +12515,12 @@
           <w:color w:val="EE0000"/>
         </w:rPr>
       </w:pPr>
-      <w:proofErr w:type="gramStart"/>
       <w:r>
         <w:rPr>
           <w:color w:val="EE0000"/>
         </w:rPr>
         <w:t>El id en guardias no es una FK del id de profesores????????</w:t>
       </w:r>
-      <w:proofErr w:type="gramEnd"/>
     </w:p>
     <w:tbl>
       <w:tblPr>
@@ -14400,7 +15126,6 @@
                 <w:szCs w:val="16"/>
               </w:rPr>
             </w:pPr>
-            <w:proofErr w:type="spellStart"/>
             <w:r>
               <w:rPr>
                 <w:rFonts w:cstheme="minorHAnsi"/>
@@ -14410,7 +15135,6 @@
               </w:rPr>
               <w:t>dia</w:t>
             </w:r>
-            <w:proofErr w:type="spellEnd"/>
           </w:p>
         </w:tc>
         <w:tc>
@@ -15461,19 +16185,11 @@
         </w:rPr>
       </w:pPr>
       <w:bookmarkStart w:id="121" w:name="_Toc49341833"/>
-      <w:proofErr w:type="gramStart"/>
       <w:r>
         <w:rPr>
           <w:color w:val="FF0000"/>
         </w:rPr>
-        <w:t>Hacer….</w:t>
-      </w:r>
-      <w:proofErr w:type="gramEnd"/>
-      <w:r>
-        <w:rPr>
-          <w:color w:val="FF0000"/>
-        </w:rPr>
-        <w:t>.</w:t>
+        <w:t>Hacer…..</w:t>
       </w:r>
     </w:p>
     <w:p>
@@ -15501,19 +16217,11 @@
           <w:color w:val="FF0000"/>
         </w:rPr>
       </w:pPr>
-      <w:proofErr w:type="gramStart"/>
       <w:r>
         <w:rPr>
           <w:color w:val="FF0000"/>
         </w:rPr>
-        <w:t>Hacer….</w:t>
-      </w:r>
-      <w:proofErr w:type="gramEnd"/>
-      <w:r>
-        <w:rPr>
-          <w:color w:val="FF0000"/>
-        </w:rPr>
-        <w:t>.</w:t>
+        <w:t>Hacer…..</w:t>
       </w:r>
     </w:p>
     <w:p/>
@@ -15544,19 +16252,11 @@
         </w:rPr>
       </w:pPr>
       <w:bookmarkStart w:id="127" w:name="_Toc49341837"/>
-      <w:proofErr w:type="gramStart"/>
       <w:r>
         <w:rPr>
           <w:color w:val="FF0000"/>
         </w:rPr>
-        <w:t>Hacer….</w:t>
-      </w:r>
-      <w:proofErr w:type="gramEnd"/>
-      <w:r>
-        <w:rPr>
-          <w:color w:val="FF0000"/>
-        </w:rPr>
-        <w:t>.</w:t>
+        <w:t>Hacer…..</w:t>
       </w:r>
     </w:p>
     <w:p>
@@ -15565,14 +16265,12 @@
       </w:pPr>
       <w:bookmarkStart w:id="128" w:name="_Toc182218982"/>
       <w:bookmarkStart w:id="129" w:name="_Toc182500159"/>
-      <w:proofErr w:type="spellStart"/>
       <w:r>
         <w:t>Logout</w:t>
       </w:r>
       <w:bookmarkEnd w:id="127"/>
       <w:bookmarkEnd w:id="128"/>
       <w:bookmarkEnd w:id="129"/>
-      <w:proofErr w:type="spellEnd"/>
     </w:p>
     <w:p>
       <w:pPr>
@@ -15586,19 +16284,11 @@
           <w:color w:val="FF0000"/>
         </w:rPr>
       </w:pPr>
-      <w:proofErr w:type="gramStart"/>
       <w:r>
         <w:rPr>
           <w:color w:val="FF0000"/>
         </w:rPr>
-        <w:t>Hacer….</w:t>
-      </w:r>
-      <w:proofErr w:type="gramEnd"/>
-      <w:r>
-        <w:rPr>
-          <w:color w:val="FF0000"/>
-        </w:rPr>
-        <w:t>.</w:t>
+        <w:t>Hacer…..</w:t>
       </w:r>
     </w:p>
     <w:p/>
@@ -15629,19 +16319,11 @@
         </w:rPr>
       </w:pPr>
       <w:bookmarkStart w:id="133" w:name="_Toc49341839"/>
-      <w:proofErr w:type="gramStart"/>
       <w:r>
         <w:rPr>
           <w:color w:val="FF0000"/>
         </w:rPr>
-        <w:t>Hacer….</w:t>
-      </w:r>
-      <w:proofErr w:type="gramEnd"/>
-      <w:r>
-        <w:rPr>
-          <w:color w:val="FF0000"/>
-        </w:rPr>
-        <w:t>.</w:t>
+        <w:t>Hacer…..</w:t>
       </w:r>
     </w:p>
     <w:p>
@@ -15670,19 +16352,11 @@
         </w:rPr>
       </w:pPr>
       <w:bookmarkStart w:id="136" w:name="_Toc49341840"/>
-      <w:proofErr w:type="gramStart"/>
       <w:r>
         <w:rPr>
           <w:color w:val="FF0000"/>
         </w:rPr>
-        <w:t>Hacer….</w:t>
-      </w:r>
-      <w:proofErr w:type="gramEnd"/>
-      <w:r>
-        <w:rPr>
-          <w:color w:val="FF0000"/>
-        </w:rPr>
-        <w:t>.</w:t>
+        <w:t>Hacer…..</w:t>
       </w:r>
     </w:p>
     <w:p>
@@ -15710,19 +16384,11 @@
           <w:color w:val="FF0000"/>
         </w:rPr>
       </w:pPr>
-      <w:proofErr w:type="gramStart"/>
       <w:r>
         <w:rPr>
           <w:color w:val="FF0000"/>
         </w:rPr>
-        <w:t>Hacer….</w:t>
-      </w:r>
-      <w:proofErr w:type="gramEnd"/>
-      <w:r>
-        <w:rPr>
-          <w:color w:val="FF0000"/>
-        </w:rPr>
-        <w:t>.</w:t>
+        <w:t>Hacer…..</w:t>
       </w:r>
     </w:p>
     <w:p/>
@@ -15767,19 +16433,11 @@
           <w:color w:val="FF0000"/>
         </w:rPr>
       </w:pPr>
-      <w:proofErr w:type="gramStart"/>
       <w:r>
         <w:rPr>
           <w:color w:val="FF0000"/>
         </w:rPr>
-        <w:t>Hacer….</w:t>
-      </w:r>
-      <w:proofErr w:type="gramEnd"/>
-      <w:r>
-        <w:rPr>
-          <w:color w:val="FF0000"/>
-        </w:rPr>
-        <w:t>.</w:t>
+        <w:t>Hacer…..</w:t>
       </w:r>
     </w:p>
     <w:p>
@@ -16201,14 +16859,9 @@
       <w:bookmarkStart w:id="152" w:name="_Toc49341858"/>
       <w:bookmarkStart w:id="153" w:name="_Toc182218988"/>
       <w:bookmarkStart w:id="154" w:name="_Toc182500166"/>
-      <w:proofErr w:type="spellStart"/>
       <w:r>
         <w:lastRenderedPageBreak/>
-        <w:t>Sql</w:t>
-      </w:r>
-      <w:proofErr w:type="spellEnd"/>
-      <w:r>
-        <w:t xml:space="preserve"> de creación (MySQL)</w:t>
+        <w:t>Sql de creación (MySQL)</w:t>
       </w:r>
       <w:bookmarkEnd w:id="149"/>
       <w:bookmarkEnd w:id="150"/>
@@ -16235,49 +16888,23 @@
         <w:jc w:val="left"/>
       </w:pPr>
       <w:r>
-        <w:t xml:space="preserve">-- Versión del servidor:         10.4.24-MariaDB-1:10.4.24+maria~focal - mariadb.org </w:t>
+        <w:t>-- Versión del servidor:         10.4.24-MariaDB-1:10.4.24+maria~focal - mariadb.org binary distribution</w:t>
       </w:r>
-      <w:proofErr w:type="spellStart"/>
-      <w:r>
-        <w:t>binary</w:t>
-      </w:r>
-      <w:proofErr w:type="spellEnd"/>
-      <w:r>
-        <w:t xml:space="preserve"> </w:t>
-      </w:r>
-      <w:proofErr w:type="spellStart"/>
-      <w:r>
-        <w:t>distribution</w:t>
-      </w:r>
-      <w:proofErr w:type="spellEnd"/>
     </w:p>
     <w:p>
       <w:pPr>
         <w:jc w:val="left"/>
       </w:pPr>
       <w:r>
-        <w:t xml:space="preserve">-- SO del servidor:              </w:t>
+        <w:t>-- SO del servidor:              debian-linux-gnu</w:t>
       </w:r>
-      <w:proofErr w:type="spellStart"/>
-      <w:r>
-        <w:t>debian-linux-gnu</w:t>
-      </w:r>
-      <w:proofErr w:type="spellEnd"/>
     </w:p>
     <w:p>
       <w:pPr>
         <w:jc w:val="left"/>
       </w:pPr>
       <w:r>
-        <w:t xml:space="preserve">-- </w:t>
-      </w:r>
-      <w:proofErr w:type="spellStart"/>
-      <w:r>
-        <w:t>HeidiSQL</w:t>
-      </w:r>
-      <w:proofErr w:type="spellEnd"/>
-      <w:r>
-        <w:t xml:space="preserve"> Versión:             12.6.0.6765</w:t>
+        <w:t>-- HeidiSQL Versión:             12.6.0.6765</w:t>
       </w:r>
     </w:p>
     <w:p>
@@ -16412,15 +17039,8 @@
         <w:jc w:val="left"/>
       </w:pPr>
       <w:r>
-        <w:t xml:space="preserve">-- Volcando estructura para tabla </w:t>
+        <w:t>-- Volcando estructura para tabla guardias.aulas</w:t>
       </w:r>
-      <w:proofErr w:type="spellStart"/>
-      <w:proofErr w:type="gramStart"/>
-      <w:r>
-        <w:t>guardias.aulas</w:t>
-      </w:r>
-      <w:proofErr w:type="spellEnd"/>
-      <w:proofErr w:type="gramEnd"/>
     </w:p>
     <w:p>
       <w:pPr>
@@ -16447,35 +17067,13 @@
         <w:rPr>
           <w:lang w:val="en-GB"/>
         </w:rPr>
-        <w:t xml:space="preserve">  `</w:t>
+        <w:t xml:space="preserve">  `nombre` </w:t>
       </w:r>
-      <w:proofErr w:type="spellStart"/>
       <w:r>
         <w:rPr>
           <w:lang w:val="en-GB"/>
         </w:rPr>
-        <w:t>nombre</w:t>
-      </w:r>
-      <w:proofErr w:type="spellEnd"/>
-      <w:r>
-        <w:rPr>
-          <w:lang w:val="en-GB"/>
-        </w:rPr>
-        <w:t xml:space="preserve">` </w:t>
-      </w:r>
-      <w:proofErr w:type="gramStart"/>
-      <w:r>
-        <w:rPr>
-          <w:lang w:val="en-GB"/>
-        </w:rPr>
-        <w:t>varchar(</w:t>
-      </w:r>
-      <w:proofErr w:type="gramEnd"/>
-      <w:r>
-        <w:rPr>
-          <w:lang w:val="en-GB"/>
-        </w:rPr>
-        <w:t xml:space="preserve">100) </w:t>
+        <w:t xml:space="preserve">varchar(100) </w:t>
       </w:r>
       <w:r>
         <w:rPr>
@@ -16495,21 +17093,51 @@
         <w:rPr>
           <w:lang w:val="en-GB"/>
         </w:rPr>
-        <w:t xml:space="preserve">  PRIMARY KEY (`</w:t>
+        <w:t xml:space="preserve">  PRIMARY KEY (`nombre`)</w:t>
       </w:r>
-      <w:proofErr w:type="spellStart"/>
+    </w:p>
+    <w:p>
+      <w:pPr>
+        <w:jc w:val="left"/>
+        <w:rPr>
+          <w:lang w:val="en-GB"/>
+        </w:rPr>
+      </w:pPr>
       <w:r>
         <w:rPr>
           <w:lang w:val="en-GB"/>
         </w:rPr>
-        <w:t>nombre</w:t>
+        <w:t>) ENGINE=InnoDB DEFAULT CHARSET=utf8 COLLATE=utf8_spanish2_ci;</w:t>
       </w:r>
-      <w:proofErr w:type="spellEnd"/>
+    </w:p>
+    <w:p>
+      <w:pPr>
+        <w:jc w:val="left"/>
+        <w:rPr>
+          <w:lang w:val="en-GB"/>
+        </w:rPr>
+      </w:pPr>
+    </w:p>
+    <w:p>
+      <w:pPr>
+        <w:jc w:val="left"/>
+      </w:pPr>
+      <w:r>
+        <w:t>-- Volcando estructura para tabla guardias.cursos</w:t>
+      </w:r>
+    </w:p>
+    <w:p>
+      <w:pPr>
+        <w:jc w:val="left"/>
+        <w:rPr>
+          <w:lang w:val="en-GB"/>
+        </w:rPr>
+      </w:pPr>
       <w:r>
         <w:rPr>
           <w:lang w:val="en-GB"/>
         </w:rPr>
-        <w:t>`)</w:t>
+        <w:t>CREATE TABLE IF NOT EXISTS `cursos` (</w:t>
       </w:r>
     </w:p>
     <w:p>
@@ -16523,114 +17151,13 @@
         <w:rPr>
           <w:lang w:val="en-GB"/>
         </w:rPr>
-        <w:t>) ENGINE=</w:t>
+        <w:t xml:space="preserve">  `nombre` </w:t>
       </w:r>
-      <w:proofErr w:type="spellStart"/>
       <w:r>
         <w:rPr>
           <w:lang w:val="en-GB"/>
         </w:rPr>
-        <w:t>InnoDB</w:t>
-      </w:r>
-      <w:proofErr w:type="spellEnd"/>
-      <w:r>
-        <w:rPr>
-          <w:lang w:val="en-GB"/>
-        </w:rPr>
-        <w:t xml:space="preserve"> DEFAULT CHARSET=utf8 COLLATE=utf8_spanish2_ci;</w:t>
-      </w:r>
-    </w:p>
-    <w:p>
-      <w:pPr>
-        <w:jc w:val="left"/>
-        <w:rPr>
-          <w:lang w:val="en-GB"/>
-        </w:rPr>
-      </w:pPr>
-    </w:p>
-    <w:p>
-      <w:pPr>
-        <w:jc w:val="left"/>
-      </w:pPr>
-      <w:r>
-        <w:t xml:space="preserve">-- Volcando estructura para tabla </w:t>
-      </w:r>
-      <w:proofErr w:type="spellStart"/>
-      <w:proofErr w:type="gramStart"/>
-      <w:r>
-        <w:t>guardias.cursos</w:t>
-      </w:r>
-      <w:proofErr w:type="spellEnd"/>
-      <w:proofErr w:type="gramEnd"/>
-    </w:p>
-    <w:p>
-      <w:pPr>
-        <w:jc w:val="left"/>
-        <w:rPr>
-          <w:lang w:val="en-GB"/>
-        </w:rPr>
-      </w:pPr>
-      <w:r>
-        <w:rPr>
-          <w:lang w:val="en-GB"/>
-        </w:rPr>
-        <w:t>CREATE TABLE IF NOT EXISTS `</w:t>
-      </w:r>
-      <w:proofErr w:type="spellStart"/>
-      <w:r>
-        <w:rPr>
-          <w:lang w:val="en-GB"/>
-        </w:rPr>
-        <w:t>cursos</w:t>
-      </w:r>
-      <w:proofErr w:type="spellEnd"/>
-      <w:r>
-        <w:rPr>
-          <w:lang w:val="en-GB"/>
-        </w:rPr>
-        <w:t>` (</w:t>
-      </w:r>
-    </w:p>
-    <w:p>
-      <w:pPr>
-        <w:jc w:val="left"/>
-        <w:rPr>
-          <w:lang w:val="en-GB"/>
-        </w:rPr>
-      </w:pPr>
-      <w:r>
-        <w:rPr>
-          <w:lang w:val="en-GB"/>
-        </w:rPr>
-        <w:t xml:space="preserve">  `</w:t>
-      </w:r>
-      <w:proofErr w:type="spellStart"/>
-      <w:r>
-        <w:rPr>
-          <w:lang w:val="en-GB"/>
-        </w:rPr>
-        <w:t>nombre</w:t>
-      </w:r>
-      <w:proofErr w:type="spellEnd"/>
-      <w:r>
-        <w:rPr>
-          <w:lang w:val="en-GB"/>
-        </w:rPr>
-        <w:t xml:space="preserve">` </w:t>
-      </w:r>
-      <w:proofErr w:type="gramStart"/>
-      <w:r>
-        <w:rPr>
-          <w:lang w:val="en-GB"/>
-        </w:rPr>
-        <w:t>varchar(</w:t>
-      </w:r>
-      <w:proofErr w:type="gramEnd"/>
-      <w:r>
-        <w:rPr>
-          <w:lang w:val="en-GB"/>
-        </w:rPr>
-        <w:t xml:space="preserve">100) </w:t>
+        <w:t xml:space="preserve">varchar(100) </w:t>
       </w:r>
       <w:r>
         <w:rPr>
@@ -16650,100 +17177,51 @@
         <w:rPr>
           <w:lang w:val="en-GB"/>
         </w:rPr>
-        <w:t xml:space="preserve">  PRIMARY KEY (`</w:t>
+        <w:t xml:space="preserve">  PRIMARY KEY (`nombre`)</w:t>
       </w:r>
-      <w:proofErr w:type="spellStart"/>
+    </w:p>
+    <w:p>
+      <w:pPr>
+        <w:jc w:val="left"/>
+        <w:rPr>
+          <w:lang w:val="en-GB"/>
+        </w:rPr>
+      </w:pPr>
       <w:r>
         <w:rPr>
           <w:lang w:val="en-GB"/>
         </w:rPr>
-        <w:t>nombre</w:t>
+        <w:t>) ENGINE=InnoDB DEFAULT CHARSET=utf8 COLLATE=utf8_spanish2_ci;</w:t>
       </w:r>
-      <w:proofErr w:type="spellEnd"/>
+    </w:p>
+    <w:p>
+      <w:pPr>
+        <w:jc w:val="left"/>
+        <w:rPr>
+          <w:lang w:val="en-GB"/>
+        </w:rPr>
+      </w:pPr>
+    </w:p>
+    <w:p>
+      <w:pPr>
+        <w:jc w:val="left"/>
+      </w:pPr>
+      <w:r>
+        <w:t>-- Volcando estructura para tabla guardias.guardias</w:t>
+      </w:r>
+    </w:p>
+    <w:p>
+      <w:pPr>
+        <w:jc w:val="left"/>
+        <w:rPr>
+          <w:lang w:val="en-GB"/>
+        </w:rPr>
+      </w:pPr>
       <w:r>
         <w:rPr>
           <w:lang w:val="en-GB"/>
         </w:rPr>
-        <w:t>`)</w:t>
-      </w:r>
-    </w:p>
-    <w:p>
-      <w:pPr>
-        <w:jc w:val="left"/>
-        <w:rPr>
-          <w:lang w:val="en-GB"/>
-        </w:rPr>
-      </w:pPr>
-      <w:r>
-        <w:rPr>
-          <w:lang w:val="en-GB"/>
-        </w:rPr>
-        <w:t>) ENGINE=</w:t>
-      </w:r>
-      <w:proofErr w:type="spellStart"/>
-      <w:r>
-        <w:rPr>
-          <w:lang w:val="en-GB"/>
-        </w:rPr>
-        <w:t>InnoDB</w:t>
-      </w:r>
-      <w:proofErr w:type="spellEnd"/>
-      <w:r>
-        <w:rPr>
-          <w:lang w:val="en-GB"/>
-        </w:rPr>
-        <w:t xml:space="preserve"> DEFAULT CHARSET=utf8 COLLATE=utf8_spanish2_ci;</w:t>
-      </w:r>
-    </w:p>
-    <w:p>
-      <w:pPr>
-        <w:jc w:val="left"/>
-        <w:rPr>
-          <w:lang w:val="en-GB"/>
-        </w:rPr>
-      </w:pPr>
-    </w:p>
-    <w:p>
-      <w:pPr>
-        <w:jc w:val="left"/>
-      </w:pPr>
-      <w:r>
-        <w:t xml:space="preserve">-- Volcando estructura para tabla </w:t>
-      </w:r>
-      <w:proofErr w:type="spellStart"/>
-      <w:proofErr w:type="gramStart"/>
-      <w:r>
-        <w:t>guardias.guardias</w:t>
-      </w:r>
-      <w:proofErr w:type="spellEnd"/>
-      <w:proofErr w:type="gramEnd"/>
-    </w:p>
-    <w:p>
-      <w:pPr>
-        <w:jc w:val="left"/>
-        <w:rPr>
-          <w:lang w:val="en-GB"/>
-        </w:rPr>
-      </w:pPr>
-      <w:r>
-        <w:rPr>
-          <w:lang w:val="en-GB"/>
-        </w:rPr>
-        <w:t>CREATE TABLE IF NOT EXISTS `</w:t>
-      </w:r>
-      <w:proofErr w:type="spellStart"/>
-      <w:r>
-        <w:rPr>
-          <w:lang w:val="en-GB"/>
-        </w:rPr>
-        <w:t>guardias</w:t>
-      </w:r>
-      <w:proofErr w:type="spellEnd"/>
-      <w:r>
-        <w:rPr>
-          <w:lang w:val="en-GB"/>
-        </w:rPr>
-        <w:t>` (</w:t>
+        <w:t>CREATE TABLE IF NOT EXISTS `guardias` (</w:t>
       </w:r>
     </w:p>
     <w:p>
@@ -16759,19 +17237,11 @@
         </w:rPr>
         <w:t xml:space="preserve">  `id` </w:t>
       </w:r>
-      <w:proofErr w:type="gramStart"/>
       <w:r>
         <w:rPr>
           <w:lang w:val="en-GB"/>
         </w:rPr>
-        <w:t>varchar(</w:t>
-      </w:r>
-      <w:proofErr w:type="gramEnd"/>
-      <w:r>
-        <w:rPr>
-          <w:lang w:val="en-GB"/>
-        </w:rPr>
-        <w:t xml:space="preserve">100) </w:t>
+        <w:t xml:space="preserve">varchar(100) </w:t>
       </w:r>
       <w:r>
         <w:rPr>
@@ -16791,21 +17261,7 @@
         <w:rPr>
           <w:lang w:val="en-GB"/>
         </w:rPr>
-        <w:t xml:space="preserve">  `</w:t>
-      </w:r>
-      <w:proofErr w:type="spellStart"/>
-      <w:r>
-        <w:rPr>
-          <w:lang w:val="en-GB"/>
-        </w:rPr>
-        <w:t>dia</w:t>
-      </w:r>
-      <w:proofErr w:type="spellEnd"/>
-      <w:r>
-        <w:rPr>
-          <w:lang w:val="en-GB"/>
-        </w:rPr>
-        <w:t>` date NOT NULL,</w:t>
+        <w:t xml:space="preserve">  `dia` date NOT NULL,</w:t>
       </w:r>
     </w:p>
     <w:p>
@@ -16821,19 +17277,11 @@
         </w:rPr>
         <w:t xml:space="preserve">  `hora` </w:t>
       </w:r>
-      <w:proofErr w:type="gramStart"/>
       <w:r>
         <w:rPr>
           <w:lang w:val="en-GB"/>
         </w:rPr>
-        <w:t>varchar(</w:t>
-      </w:r>
-      <w:proofErr w:type="gramEnd"/>
-      <w:r>
-        <w:rPr>
-          <w:lang w:val="en-GB"/>
-        </w:rPr>
-        <w:t xml:space="preserve">100) </w:t>
+        <w:t xml:space="preserve">varchar(100) </w:t>
       </w:r>
       <w:r>
         <w:rPr>
@@ -16853,35 +17301,13 @@
         <w:rPr>
           <w:lang w:val="en-GB"/>
         </w:rPr>
-        <w:t xml:space="preserve">  `</w:t>
+        <w:t xml:space="preserve">  `curso` </w:t>
       </w:r>
-      <w:proofErr w:type="spellStart"/>
       <w:r>
         <w:rPr>
           <w:lang w:val="en-GB"/>
         </w:rPr>
-        <w:t>curso</w:t>
-      </w:r>
-      <w:proofErr w:type="spellEnd"/>
-      <w:r>
-        <w:rPr>
-          <w:lang w:val="en-GB"/>
-        </w:rPr>
-        <w:t xml:space="preserve">` </w:t>
-      </w:r>
-      <w:proofErr w:type="gramStart"/>
-      <w:r>
-        <w:rPr>
-          <w:lang w:val="en-GB"/>
-        </w:rPr>
-        <w:t>varchar(</w:t>
-      </w:r>
-      <w:proofErr w:type="gramEnd"/>
-      <w:r>
-        <w:rPr>
-          <w:lang w:val="en-GB"/>
-        </w:rPr>
-        <w:t xml:space="preserve">100) </w:t>
+        <w:t xml:space="preserve">varchar(100) </w:t>
       </w:r>
       <w:r>
         <w:rPr>
@@ -16903,19 +17329,11 @@
         </w:rPr>
         <w:t xml:space="preserve">  `aula` </w:t>
       </w:r>
-      <w:proofErr w:type="gramStart"/>
       <w:r>
         <w:rPr>
           <w:lang w:val="en-GB"/>
         </w:rPr>
-        <w:t>varchar(</w:t>
-      </w:r>
-      <w:proofErr w:type="gramEnd"/>
-      <w:r>
-        <w:rPr>
-          <w:lang w:val="en-GB"/>
-        </w:rPr>
-        <w:t xml:space="preserve">100) </w:t>
+        <w:t xml:space="preserve">varchar(100) </w:t>
       </w:r>
       <w:r>
         <w:rPr>
@@ -16935,121 +17353,35 @@
         <w:rPr>
           <w:lang w:val="en-GB"/>
         </w:rPr>
-        <w:t xml:space="preserve">  `</w:t>
+        <w:t xml:space="preserve">  `tarea` varchar(1) COLLATE utf8_spanish2_ci NOT NULL DEFAULT 'N',</w:t>
       </w:r>
-      <w:proofErr w:type="spellStart"/>
+    </w:p>
+    <w:p>
+      <w:pPr>
+        <w:jc w:val="left"/>
+        <w:rPr>
+          <w:lang w:val="en-GB"/>
+        </w:rPr>
+      </w:pPr>
       <w:r>
         <w:rPr>
           <w:lang w:val="en-GB"/>
         </w:rPr>
-        <w:t>tarea</w:t>
+        <w:t xml:space="preserve">  `ficheros` mediumtext COLLATE utf8_spanish2_ci DEFAULT NULL,</w:t>
       </w:r>
-      <w:proofErr w:type="spellEnd"/>
+    </w:p>
+    <w:p>
+      <w:pPr>
+        <w:jc w:val="left"/>
+        <w:rPr>
+          <w:lang w:val="en-GB"/>
+        </w:rPr>
+      </w:pPr>
       <w:r>
         <w:rPr>
           <w:lang w:val="en-GB"/>
         </w:rPr>
-        <w:t xml:space="preserve">` </w:t>
-      </w:r>
-      <w:proofErr w:type="gramStart"/>
-      <w:r>
-        <w:rPr>
-          <w:lang w:val="en-GB"/>
-        </w:rPr>
-        <w:t>varchar(</w:t>
-      </w:r>
-      <w:proofErr w:type="gramEnd"/>
-      <w:r>
-        <w:rPr>
-          <w:lang w:val="en-GB"/>
-        </w:rPr>
-        <w:t>1) COLLATE utf8_spanish2_ci NOT NULL DEFAULT 'N',</w:t>
-      </w:r>
-    </w:p>
-    <w:p>
-      <w:pPr>
-        <w:jc w:val="left"/>
-        <w:rPr>
-          <w:lang w:val="en-GB"/>
-        </w:rPr>
-      </w:pPr>
-      <w:r>
-        <w:rPr>
-          <w:lang w:val="en-GB"/>
-        </w:rPr>
-        <w:t xml:space="preserve">  `</w:t>
-      </w:r>
-      <w:proofErr w:type="spellStart"/>
-      <w:r>
-        <w:rPr>
-          <w:lang w:val="en-GB"/>
-        </w:rPr>
-        <w:t>ficheros</w:t>
-      </w:r>
-      <w:proofErr w:type="spellEnd"/>
-      <w:r>
-        <w:rPr>
-          <w:lang w:val="en-GB"/>
-        </w:rPr>
-        <w:t xml:space="preserve">` </w:t>
-      </w:r>
-      <w:proofErr w:type="spellStart"/>
-      <w:r>
-        <w:rPr>
-          <w:lang w:val="en-GB"/>
-        </w:rPr>
-        <w:t>mediumtext</w:t>
-      </w:r>
-      <w:proofErr w:type="spellEnd"/>
-      <w:r>
-        <w:rPr>
-          <w:lang w:val="en-GB"/>
-        </w:rPr>
-        <w:t xml:space="preserve"> COLLATE utf8_spanish2_ci DEFAULT NULL,</w:t>
-      </w:r>
-    </w:p>
-    <w:p>
-      <w:pPr>
-        <w:jc w:val="left"/>
-        <w:rPr>
-          <w:lang w:val="en-GB"/>
-        </w:rPr>
-      </w:pPr>
-      <w:r>
-        <w:rPr>
-          <w:lang w:val="en-GB"/>
-        </w:rPr>
-        <w:t xml:space="preserve">  PRIMARY KEY (`id</w:t>
-      </w:r>
-      <w:proofErr w:type="gramStart"/>
-      <w:r>
-        <w:rPr>
-          <w:lang w:val="en-GB"/>
-        </w:rPr>
-        <w:t>`,`</w:t>
-      </w:r>
-      <w:proofErr w:type="spellStart"/>
-      <w:proofErr w:type="gramEnd"/>
-      <w:r>
-        <w:rPr>
-          <w:lang w:val="en-GB"/>
-        </w:rPr>
-        <w:t>dia</w:t>
-      </w:r>
-      <w:proofErr w:type="spellEnd"/>
-      <w:proofErr w:type="gramStart"/>
-      <w:r>
-        <w:rPr>
-          <w:lang w:val="en-GB"/>
-        </w:rPr>
-        <w:t>`,`</w:t>
-      </w:r>
-      <w:proofErr w:type="gramEnd"/>
-      <w:r>
-        <w:rPr>
-          <w:lang w:val="en-GB"/>
-        </w:rPr>
-        <w:t>hora`),</w:t>
+        <w:t xml:space="preserve">  PRIMARY KEY (`id`,`dia`,`hora`),</w:t>
       </w:r>
     </w:p>
     <w:p>
@@ -17063,15 +17395,7 @@
         <w:t xml:space="preserve">  </w:t>
       </w:r>
       <w:r>
-        <w:t>KEY `</w:t>
-      </w:r>
-      <w:proofErr w:type="spellStart"/>
-      <w:r>
-        <w:t>FK_horas</w:t>
-      </w:r>
-      <w:proofErr w:type="spellEnd"/>
-      <w:r>
-        <w:t>` (`hora`),</w:t>
+        <w:t>KEY `FK_horas` (`hora`),</w:t>
       </w:r>
     </w:p>
     <w:p>
@@ -17079,15 +17403,7 @@
         <w:jc w:val="left"/>
       </w:pPr>
       <w:r>
-        <w:t xml:space="preserve">  KEY `</w:t>
-      </w:r>
-      <w:proofErr w:type="spellStart"/>
-      <w:r>
-        <w:t>FK_curso</w:t>
-      </w:r>
-      <w:proofErr w:type="spellEnd"/>
-      <w:r>
-        <w:t>` (`curso`),</w:t>
+        <w:t xml:space="preserve">  KEY `FK_curso` (`curso`),</w:t>
       </w:r>
     </w:p>
     <w:p>
@@ -17104,21 +17420,7 @@
         <w:rPr>
           <w:lang w:val="en-GB"/>
         </w:rPr>
-        <w:t>KEY `</w:t>
-      </w:r>
-      <w:proofErr w:type="spellStart"/>
-      <w:r>
-        <w:rPr>
-          <w:lang w:val="en-GB"/>
-        </w:rPr>
-        <w:t>FK_aulas</w:t>
-      </w:r>
-      <w:proofErr w:type="spellEnd"/>
-      <w:r>
-        <w:rPr>
-          <w:lang w:val="en-GB"/>
-        </w:rPr>
-        <w:t>` (`aula`),</w:t>
+        <w:t>KEY `FK_aulas` (`aula`),</w:t>
       </w:r>
     </w:p>
     <w:p>
@@ -17133,35 +17435,49 @@
           <w:lang w:val="en-GB"/>
         </w:rPr>
         <w:lastRenderedPageBreak/>
-        <w:t xml:space="preserve">  CONSTRAINT `</w:t>
+        <w:t xml:space="preserve">  CONSTRAINT `FK_aulas` FOREIGN KEY (`aula`) REFERENCES `aulas` (`nombre`) ON DELETE NO ACTION ON UPDATE NO ACTION,</w:t>
       </w:r>
-      <w:proofErr w:type="spellStart"/>
+    </w:p>
+    <w:p>
+      <w:pPr>
+        <w:jc w:val="left"/>
+        <w:rPr>
+          <w:lang w:val="en-GB"/>
+        </w:rPr>
+      </w:pPr>
       <w:r>
         <w:rPr>
           <w:lang w:val="en-GB"/>
         </w:rPr>
-        <w:t>FK_aulas</w:t>
+        <w:t xml:space="preserve">  CONSTRAINT `FK_curso` FOREIGN KEY (`curso`) REFERENCES `cursos` (`nombre`) ON DELETE NO ACTION ON UPDATE NO ACTION,</w:t>
       </w:r>
-      <w:proofErr w:type="spellEnd"/>
+    </w:p>
+    <w:p>
+      <w:pPr>
+        <w:jc w:val="left"/>
+        <w:rPr>
+          <w:lang w:val="en-GB"/>
+        </w:rPr>
+      </w:pPr>
       <w:r>
         <w:rPr>
           <w:lang w:val="en-GB"/>
         </w:rPr>
-        <w:t>` FOREIGN KEY (`aula`) REFERENCES `aulas` (`</w:t>
+        <w:t xml:space="preserve">  CONSTRAINT `FK_horas` FOREIGN KEY (`hora`) REFERENCES `horas` (`nombre`) ON DELETE NO ACTION ON UPDATE NO ACTION</w:t>
       </w:r>
-      <w:proofErr w:type="spellStart"/>
+    </w:p>
+    <w:p>
+      <w:pPr>
+        <w:jc w:val="left"/>
+        <w:rPr>
+          <w:lang w:val="en-GB"/>
+        </w:rPr>
+      </w:pPr>
       <w:r>
         <w:rPr>
           <w:lang w:val="en-GB"/>
         </w:rPr>
-        <w:t>nombre</w:t>
-      </w:r>
-      <w:proofErr w:type="spellEnd"/>
-      <w:r>
-        <w:rPr>
-          <w:lang w:val="en-GB"/>
-        </w:rPr>
-        <w:t>`) ON DELETE NO ACTION ON UPDATE NO ACTION,</w:t>
+        <w:t>) ENGINE=InnoDB DEFAULT CHARSET=utf8 COLLATE=utf8_spanish2_ci;</w:t>
       </w:r>
     </w:p>
     <w:p>
@@ -17171,161 +17487,14 @@
           <w:lang w:val="en-GB"/>
         </w:rPr>
       </w:pPr>
-      <w:r>
-        <w:rPr>
-          <w:lang w:val="en-GB"/>
-        </w:rPr>
-        <w:t xml:space="preserve">  CONSTRAINT `</w:t>
-      </w:r>
-      <w:proofErr w:type="spellStart"/>
-      <w:r>
-        <w:rPr>
-          <w:lang w:val="en-GB"/>
-        </w:rPr>
-        <w:t>FK_curso</w:t>
-      </w:r>
-      <w:proofErr w:type="spellEnd"/>
-      <w:r>
-        <w:rPr>
-          <w:lang w:val="en-GB"/>
-        </w:rPr>
-        <w:t>` FOREIGN KEY (`</w:t>
-      </w:r>
-      <w:proofErr w:type="spellStart"/>
-      <w:r>
-        <w:rPr>
-          <w:lang w:val="en-GB"/>
-        </w:rPr>
-        <w:t>curso</w:t>
-      </w:r>
-      <w:proofErr w:type="spellEnd"/>
-      <w:r>
-        <w:rPr>
-          <w:lang w:val="en-GB"/>
-        </w:rPr>
-        <w:t>`) REFERENCES `</w:t>
-      </w:r>
-      <w:proofErr w:type="spellStart"/>
-      <w:r>
-        <w:rPr>
-          <w:lang w:val="en-GB"/>
-        </w:rPr>
-        <w:t>cursos</w:t>
-      </w:r>
-      <w:proofErr w:type="spellEnd"/>
-      <w:r>
-        <w:rPr>
-          <w:lang w:val="en-GB"/>
-        </w:rPr>
-        <w:t>` (`</w:t>
-      </w:r>
-      <w:proofErr w:type="spellStart"/>
-      <w:r>
-        <w:rPr>
-          <w:lang w:val="en-GB"/>
-        </w:rPr>
-        <w:t>nombre</w:t>
-      </w:r>
-      <w:proofErr w:type="spellEnd"/>
-      <w:r>
-        <w:rPr>
-          <w:lang w:val="en-GB"/>
-        </w:rPr>
-        <w:t>`) ON DELETE NO ACTION ON UPDATE NO ACTION,</w:t>
-      </w:r>
     </w:p>
     <w:p>
       <w:pPr>
         <w:jc w:val="left"/>
-        <w:rPr>
-          <w:lang w:val="en-GB"/>
-        </w:rPr>
       </w:pPr>
       <w:r>
-        <w:rPr>
-          <w:lang w:val="en-GB"/>
-        </w:rPr>
-        <w:t xml:space="preserve">  CONSTRAINT `</w:t>
+        <w:t>-- Volcando estructura para tabla guardias.horas</w:t>
       </w:r>
-      <w:proofErr w:type="spellStart"/>
-      <w:r>
-        <w:rPr>
-          <w:lang w:val="en-GB"/>
-        </w:rPr>
-        <w:t>FK_horas</w:t>
-      </w:r>
-      <w:proofErr w:type="spellEnd"/>
-      <w:r>
-        <w:rPr>
-          <w:lang w:val="en-GB"/>
-        </w:rPr>
-        <w:t>` FOREIGN KEY (`hora`) REFERENCES `horas` (`</w:t>
-      </w:r>
-      <w:proofErr w:type="spellStart"/>
-      <w:r>
-        <w:rPr>
-          <w:lang w:val="en-GB"/>
-        </w:rPr>
-        <w:t>nombre</w:t>
-      </w:r>
-      <w:proofErr w:type="spellEnd"/>
-      <w:r>
-        <w:rPr>
-          <w:lang w:val="en-GB"/>
-        </w:rPr>
-        <w:t>`) ON DELETE NO ACTION ON UPDATE NO ACTION</w:t>
-      </w:r>
-    </w:p>
-    <w:p>
-      <w:pPr>
-        <w:jc w:val="left"/>
-        <w:rPr>
-          <w:lang w:val="en-GB"/>
-        </w:rPr>
-      </w:pPr>
-      <w:r>
-        <w:rPr>
-          <w:lang w:val="en-GB"/>
-        </w:rPr>
-        <w:t>) ENGINE=</w:t>
-      </w:r>
-      <w:proofErr w:type="spellStart"/>
-      <w:r>
-        <w:rPr>
-          <w:lang w:val="en-GB"/>
-        </w:rPr>
-        <w:t>InnoDB</w:t>
-      </w:r>
-      <w:proofErr w:type="spellEnd"/>
-      <w:r>
-        <w:rPr>
-          <w:lang w:val="en-GB"/>
-        </w:rPr>
-        <w:t xml:space="preserve"> DEFAULT CHARSET=utf8 COLLATE=utf8_spanish2_ci;</w:t>
-      </w:r>
-    </w:p>
-    <w:p>
-      <w:pPr>
-        <w:jc w:val="left"/>
-        <w:rPr>
-          <w:lang w:val="en-GB"/>
-        </w:rPr>
-      </w:pPr>
-    </w:p>
-    <w:p>
-      <w:pPr>
-        <w:jc w:val="left"/>
-      </w:pPr>
-      <w:r>
-        <w:t xml:space="preserve">-- Volcando estructura para tabla </w:t>
-      </w:r>
-      <w:proofErr w:type="spellStart"/>
-      <w:proofErr w:type="gramStart"/>
-      <w:r>
-        <w:t>guardias.horas</w:t>
-      </w:r>
-      <w:proofErr w:type="spellEnd"/>
-      <w:proofErr w:type="gramEnd"/>
     </w:p>
     <w:p>
       <w:pPr>
@@ -17352,35 +17521,13 @@
         <w:rPr>
           <w:lang w:val="en-GB"/>
         </w:rPr>
-        <w:t xml:space="preserve">  `</w:t>
+        <w:t xml:space="preserve">  `nombre` </w:t>
       </w:r>
-      <w:proofErr w:type="spellStart"/>
       <w:r>
         <w:rPr>
           <w:lang w:val="en-GB"/>
         </w:rPr>
-        <w:t>nombre</w:t>
-      </w:r>
-      <w:proofErr w:type="spellEnd"/>
-      <w:r>
-        <w:rPr>
-          <w:lang w:val="en-GB"/>
-        </w:rPr>
-        <w:t xml:space="preserve">` </w:t>
-      </w:r>
-      <w:proofErr w:type="gramStart"/>
-      <w:r>
-        <w:rPr>
-          <w:lang w:val="en-GB"/>
-        </w:rPr>
-        <w:t>varchar(</w:t>
-      </w:r>
-      <w:proofErr w:type="gramEnd"/>
-      <w:r>
-        <w:rPr>
-          <w:lang w:val="en-GB"/>
-        </w:rPr>
-        <w:t xml:space="preserve">100) </w:t>
+        <w:t xml:space="preserve">varchar(100) </w:t>
       </w:r>
       <w:r>
         <w:rPr>
@@ -17400,100 +17547,51 @@
         <w:rPr>
           <w:lang w:val="en-GB"/>
         </w:rPr>
-        <w:t xml:space="preserve">  PRIMARY KEY (`</w:t>
+        <w:t xml:space="preserve">  PRIMARY KEY (`nombre`)</w:t>
       </w:r>
-      <w:proofErr w:type="spellStart"/>
+    </w:p>
+    <w:p>
+      <w:pPr>
+        <w:jc w:val="left"/>
+        <w:rPr>
+          <w:lang w:val="en-GB"/>
+        </w:rPr>
+      </w:pPr>
       <w:r>
         <w:rPr>
           <w:lang w:val="en-GB"/>
         </w:rPr>
-        <w:t>nombre</w:t>
+        <w:t>) ENGINE=InnoDB DEFAULT CHARSET=utf8 COLLATE=utf8_spanish2_ci;</w:t>
       </w:r>
-      <w:proofErr w:type="spellEnd"/>
+    </w:p>
+    <w:p>
+      <w:pPr>
+        <w:jc w:val="left"/>
+        <w:rPr>
+          <w:lang w:val="en-GB"/>
+        </w:rPr>
+      </w:pPr>
+    </w:p>
+    <w:p>
+      <w:pPr>
+        <w:jc w:val="left"/>
+      </w:pPr>
+      <w:r>
+        <w:t>-- Volcando estructura para tabla guardias.profesores</w:t>
+      </w:r>
+    </w:p>
+    <w:p>
+      <w:pPr>
+        <w:jc w:val="left"/>
+        <w:rPr>
+          <w:lang w:val="en-GB"/>
+        </w:rPr>
+      </w:pPr>
       <w:r>
         <w:rPr>
           <w:lang w:val="en-GB"/>
         </w:rPr>
-        <w:t>`)</w:t>
-      </w:r>
-    </w:p>
-    <w:p>
-      <w:pPr>
-        <w:jc w:val="left"/>
-        <w:rPr>
-          <w:lang w:val="en-GB"/>
-        </w:rPr>
-      </w:pPr>
-      <w:r>
-        <w:rPr>
-          <w:lang w:val="en-GB"/>
-        </w:rPr>
-        <w:t>) ENGINE=</w:t>
-      </w:r>
-      <w:proofErr w:type="spellStart"/>
-      <w:r>
-        <w:rPr>
-          <w:lang w:val="en-GB"/>
-        </w:rPr>
-        <w:t>InnoDB</w:t>
-      </w:r>
-      <w:proofErr w:type="spellEnd"/>
-      <w:r>
-        <w:rPr>
-          <w:lang w:val="en-GB"/>
-        </w:rPr>
-        <w:t xml:space="preserve"> DEFAULT CHARSET=utf8 COLLATE=utf8_spanish2_ci;</w:t>
-      </w:r>
-    </w:p>
-    <w:p>
-      <w:pPr>
-        <w:jc w:val="left"/>
-        <w:rPr>
-          <w:lang w:val="en-GB"/>
-        </w:rPr>
-      </w:pPr>
-    </w:p>
-    <w:p>
-      <w:pPr>
-        <w:jc w:val="left"/>
-      </w:pPr>
-      <w:r>
-        <w:t xml:space="preserve">-- Volcando estructura para tabla </w:t>
-      </w:r>
-      <w:proofErr w:type="spellStart"/>
-      <w:proofErr w:type="gramStart"/>
-      <w:r>
-        <w:t>guardias.profesores</w:t>
-      </w:r>
-      <w:proofErr w:type="spellEnd"/>
-      <w:proofErr w:type="gramEnd"/>
-    </w:p>
-    <w:p>
-      <w:pPr>
-        <w:jc w:val="left"/>
-        <w:rPr>
-          <w:lang w:val="en-GB"/>
-        </w:rPr>
-      </w:pPr>
-      <w:r>
-        <w:rPr>
-          <w:lang w:val="en-GB"/>
-        </w:rPr>
-        <w:t>CREATE TABLE IF NOT EXISTS `</w:t>
-      </w:r>
-      <w:proofErr w:type="spellStart"/>
-      <w:r>
-        <w:rPr>
-          <w:lang w:val="en-GB"/>
-        </w:rPr>
-        <w:t>profesores</w:t>
-      </w:r>
-      <w:proofErr w:type="spellEnd"/>
-      <w:r>
-        <w:rPr>
-          <w:lang w:val="en-GB"/>
-        </w:rPr>
-        <w:t>` (</w:t>
+        <w:t>CREATE TABLE IF NOT EXISTS `profesores` (</w:t>
       </w:r>
     </w:p>
     <w:p>
@@ -17509,19 +17607,11 @@
         </w:rPr>
         <w:t xml:space="preserve">  `id` </w:t>
       </w:r>
-      <w:proofErr w:type="gramStart"/>
       <w:r>
         <w:rPr>
           <w:lang w:val="en-GB"/>
         </w:rPr>
-        <w:t>varchar(</w:t>
-      </w:r>
-      <w:proofErr w:type="gramEnd"/>
-      <w:r>
-        <w:rPr>
-          <w:lang w:val="en-GB"/>
-        </w:rPr>
-        <w:t xml:space="preserve">100) </w:t>
+        <w:t xml:space="preserve">varchar(100) </w:t>
       </w:r>
       <w:r>
         <w:rPr>
@@ -17541,105 +17631,35 @@
         <w:rPr>
           <w:lang w:val="en-GB"/>
         </w:rPr>
-        <w:t xml:space="preserve">  `</w:t>
+        <w:t xml:space="preserve">  `nombre` varchar(255) COLLATE utf8_spanish2_ci NOT NULL,</w:t>
       </w:r>
-      <w:proofErr w:type="spellStart"/>
+    </w:p>
+    <w:p>
+      <w:pPr>
+        <w:jc w:val="left"/>
+        <w:rPr>
+          <w:lang w:val="en-GB"/>
+        </w:rPr>
+      </w:pPr>
       <w:r>
         <w:rPr>
           <w:lang w:val="en-GB"/>
         </w:rPr>
-        <w:t>nombre</w:t>
+        <w:t xml:space="preserve">  `apellidos` varchar(255) COLLATE utf8_spanish2_ci NOT NULL,</w:t>
       </w:r>
-      <w:proofErr w:type="spellEnd"/>
+    </w:p>
+    <w:p>
+      <w:pPr>
+        <w:jc w:val="left"/>
+        <w:rPr>
+          <w:lang w:val="en-GB"/>
+        </w:rPr>
+      </w:pPr>
       <w:r>
         <w:rPr>
           <w:lang w:val="en-GB"/>
         </w:rPr>
-        <w:t xml:space="preserve">` </w:t>
-      </w:r>
-      <w:proofErr w:type="gramStart"/>
-      <w:r>
-        <w:rPr>
-          <w:lang w:val="en-GB"/>
-        </w:rPr>
-        <w:t>varchar(</w:t>
-      </w:r>
-      <w:proofErr w:type="gramEnd"/>
-      <w:r>
-        <w:rPr>
-          <w:lang w:val="en-GB"/>
-        </w:rPr>
-        <w:t>255) COLLATE utf8_spanish2_ci NOT NULL,</w:t>
-      </w:r>
-    </w:p>
-    <w:p>
-      <w:pPr>
-        <w:jc w:val="left"/>
-        <w:rPr>
-          <w:lang w:val="en-GB"/>
-        </w:rPr>
-      </w:pPr>
-      <w:r>
-        <w:rPr>
-          <w:lang w:val="en-GB"/>
-        </w:rPr>
-        <w:t xml:space="preserve">  `</w:t>
-      </w:r>
-      <w:proofErr w:type="spellStart"/>
-      <w:r>
-        <w:rPr>
-          <w:lang w:val="en-GB"/>
-        </w:rPr>
-        <w:t>apellidos</w:t>
-      </w:r>
-      <w:proofErr w:type="spellEnd"/>
-      <w:r>
-        <w:rPr>
-          <w:lang w:val="en-GB"/>
-        </w:rPr>
-        <w:t xml:space="preserve">` </w:t>
-      </w:r>
-      <w:proofErr w:type="gramStart"/>
-      <w:r>
-        <w:rPr>
-          <w:lang w:val="en-GB"/>
-        </w:rPr>
-        <w:t>varchar(</w:t>
-      </w:r>
-      <w:proofErr w:type="gramEnd"/>
-      <w:r>
-        <w:rPr>
-          <w:lang w:val="en-GB"/>
-        </w:rPr>
-        <w:t>255) COLLATE utf8_spanish2_ci NOT NULL,</w:t>
-      </w:r>
-    </w:p>
-    <w:p>
-      <w:pPr>
-        <w:jc w:val="left"/>
-        <w:rPr>
-          <w:lang w:val="en-GB"/>
-        </w:rPr>
-      </w:pPr>
-      <w:r>
-        <w:rPr>
-          <w:lang w:val="en-GB"/>
-        </w:rPr>
-        <w:t xml:space="preserve">  `clave` </w:t>
-      </w:r>
-      <w:proofErr w:type="gramStart"/>
-      <w:r>
-        <w:rPr>
-          <w:lang w:val="en-GB"/>
-        </w:rPr>
-        <w:t>varchar(</w:t>
-      </w:r>
-      <w:proofErr w:type="gramEnd"/>
-      <w:r>
-        <w:rPr>
-          <w:lang w:val="en-GB"/>
-        </w:rPr>
-        <w:t>255) COLLATE utf8_spanish2_ci NOT NULL,</w:t>
+        <w:t xml:space="preserve">  `clave` varchar(255) COLLATE utf8_spanish2_ci NOT NULL,</w:t>
       </w:r>
     </w:p>
     <w:p>
@@ -17667,21 +17687,43 @@
         <w:rPr>
           <w:lang w:val="en-GB"/>
         </w:rPr>
-        <w:t>) ENGINE=</w:t>
+        <w:t>) ENGINE=InnoDB DEFAULT CHARSET=utf8 COLLATE=utf8_spanish2_ci;</w:t>
       </w:r>
-      <w:proofErr w:type="spellStart"/>
+    </w:p>
+    <w:p>
+      <w:pPr>
+        <w:jc w:val="left"/>
+        <w:rPr>
+          <w:lang w:val="en-GB"/>
+        </w:rPr>
+      </w:pPr>
+    </w:p>
+    <w:p>
+      <w:pPr>
+        <w:jc w:val="left"/>
+        <w:rPr>
+          <w:lang w:val="en-GB"/>
+        </w:rPr>
+      </w:pPr>
       <w:r>
         <w:rPr>
           <w:lang w:val="en-GB"/>
         </w:rPr>
-        <w:t>InnoDB</w:t>
+        <w:t>/*!40103 SET TIME_ZONE=IFNULL(@OLD_TIME_ZONE, 'system') */;</w:t>
       </w:r>
-      <w:proofErr w:type="spellEnd"/>
+    </w:p>
+    <w:p>
+      <w:pPr>
+        <w:jc w:val="left"/>
+        <w:rPr>
+          <w:lang w:val="en-GB"/>
+        </w:rPr>
+      </w:pPr>
       <w:r>
         <w:rPr>
           <w:lang w:val="en-GB"/>
         </w:rPr>
-        <w:t xml:space="preserve"> DEFAULT CHARSET=utf8 COLLATE=utf8_spanish2_ci;</w:t>
+        <w:t>/*!40101 SET SQL_MODE=IFNULL(@OLD_SQL_MODE, '') */;</w:t>
       </w:r>
     </w:p>
     <w:p>
@@ -17691,89 +17733,11 @@
           <w:lang w:val="en-GB"/>
         </w:rPr>
       </w:pPr>
-    </w:p>
-    <w:p>
-      <w:pPr>
-        <w:jc w:val="left"/>
-        <w:rPr>
-          <w:lang w:val="en-GB"/>
-        </w:rPr>
-      </w:pPr>
       <w:r>
         <w:rPr>
           <w:lang w:val="en-GB"/>
         </w:rPr>
-        <w:t>/*!40103 SET TIME_ZONE=</w:t>
-      </w:r>
-      <w:proofErr w:type="gramStart"/>
-      <w:r>
-        <w:rPr>
-          <w:lang w:val="en-GB"/>
-        </w:rPr>
-        <w:t>IFNULL(</w:t>
-      </w:r>
-      <w:proofErr w:type="gramEnd"/>
-      <w:r>
-        <w:rPr>
-          <w:lang w:val="en-GB"/>
-        </w:rPr>
-        <w:t>@OLD_TIME_ZONE, 'system') */;</w:t>
-      </w:r>
-    </w:p>
-    <w:p>
-      <w:pPr>
-        <w:jc w:val="left"/>
-        <w:rPr>
-          <w:lang w:val="en-GB"/>
-        </w:rPr>
-      </w:pPr>
-      <w:r>
-        <w:rPr>
-          <w:lang w:val="en-GB"/>
-        </w:rPr>
-        <w:t>/*!40101 SET SQL_MODE=</w:t>
-      </w:r>
-      <w:proofErr w:type="gramStart"/>
-      <w:r>
-        <w:rPr>
-          <w:lang w:val="en-GB"/>
-        </w:rPr>
-        <w:t>IFNULL(</w:t>
-      </w:r>
-      <w:proofErr w:type="gramEnd"/>
-      <w:r>
-        <w:rPr>
-          <w:lang w:val="en-GB"/>
-        </w:rPr>
-        <w:t>@OLD_SQL_MODE, '') */;</w:t>
-      </w:r>
-    </w:p>
-    <w:p>
-      <w:pPr>
-        <w:jc w:val="left"/>
-        <w:rPr>
-          <w:lang w:val="en-GB"/>
-        </w:rPr>
-      </w:pPr>
-      <w:r>
-        <w:rPr>
-          <w:lang w:val="en-GB"/>
-        </w:rPr>
-        <w:t>/*!40014 SET FOREIGN_KEY_CHECKS=</w:t>
-      </w:r>
-      <w:proofErr w:type="gramStart"/>
-      <w:r>
-        <w:rPr>
-          <w:lang w:val="en-GB"/>
-        </w:rPr>
-        <w:t>IFNULL(</w:t>
-      </w:r>
-      <w:proofErr w:type="gramEnd"/>
-      <w:r>
-        <w:rPr>
-          <w:lang w:val="en-GB"/>
-        </w:rPr>
-        <w:t>@OLD_FOREIGN_KEY_CHECKS, 1) */;</w:t>
+        <w:t>/*!40014 SET FOREIGN_KEY_CHECKS=IFNULL(@OLD_FOREIGN_KEY_CHECKS, 1) */;</w:t>
       </w:r>
     </w:p>
     <w:p>
@@ -17805,21 +17769,7 @@
         <w:rPr>
           <w:lang w:val="en-GB"/>
         </w:rPr>
-        <w:t>/*!40111 SET SQL_NOTES=</w:t>
-      </w:r>
-      <w:proofErr w:type="gramStart"/>
-      <w:r>
-        <w:rPr>
-          <w:lang w:val="en-GB"/>
-        </w:rPr>
-        <w:t>IFNULL(</w:t>
-      </w:r>
-      <w:proofErr w:type="gramEnd"/>
-      <w:r>
-        <w:rPr>
-          <w:lang w:val="en-GB"/>
-        </w:rPr>
-        <w:t>@OLD_SQL_NOTES, 1) */;</w:t>
+        <w:t>/*!40111 SET SQL_NOTES=IFNULL(@OLD_SQL_NOTES, 1) */;</w:t>
       </w:r>
       <w:r>
         <w:rPr>
@@ -18482,25 +18432,7 @@
                 <w:sz w:val="16"/>
                 <w:szCs w:val="16"/>
               </w:rPr>
-              <w:t xml:space="preserve"> </w:t>
-            </w:r>
-            <w:proofErr w:type="spellStart"/>
-            <w:r>
-              <w:rPr>
-                <w:rFonts w:cstheme="minorHAnsi"/>
-                <w:sz w:val="16"/>
-                <w:szCs w:val="16"/>
-              </w:rPr>
-              <w:t>edge</w:t>
-            </w:r>
-            <w:proofErr w:type="spellEnd"/>
-            <w:r>
-              <w:rPr>
-                <w:rFonts w:cstheme="minorHAnsi"/>
-                <w:sz w:val="16"/>
-                <w:szCs w:val="16"/>
-              </w:rPr>
-              <w:t>?</w:t>
+              <w:t xml:space="preserve"> edge?</w:t>
             </w:r>
           </w:p>
         </w:tc>
@@ -18718,25 +18650,7 @@
                 <w:sz w:val="16"/>
                 <w:szCs w:val="16"/>
               </w:rPr>
-              <w:t xml:space="preserve"> </w:t>
-            </w:r>
-            <w:proofErr w:type="spellStart"/>
-            <w:r>
-              <w:rPr>
-                <w:rFonts w:cstheme="minorHAnsi"/>
-                <w:sz w:val="16"/>
-                <w:szCs w:val="16"/>
-              </w:rPr>
-              <w:t>chrome</w:t>
-            </w:r>
-            <w:proofErr w:type="spellEnd"/>
-            <w:r>
-              <w:rPr>
-                <w:rFonts w:cstheme="minorHAnsi"/>
-                <w:sz w:val="16"/>
-                <w:szCs w:val="16"/>
-              </w:rPr>
-              <w:t>?</w:t>
+              <w:t xml:space="preserve"> chrome?</w:t>
             </w:r>
           </w:p>
         </w:tc>
@@ -20460,25 +20374,7 @@
                 <w:sz w:val="16"/>
                 <w:szCs w:val="16"/>
               </w:rPr>
-              <w:t xml:space="preserve">¿Funciona con </w:t>
-            </w:r>
-            <w:proofErr w:type="spellStart"/>
-            <w:r>
-              <w:rPr>
-                <w:rFonts w:cstheme="minorHAnsi"/>
-                <w:sz w:val="16"/>
-                <w:szCs w:val="16"/>
-              </w:rPr>
-              <w:t>táblets</w:t>
-            </w:r>
-            <w:proofErr w:type="spellEnd"/>
-            <w:r>
-              <w:rPr>
-                <w:rFonts w:cstheme="minorHAnsi"/>
-                <w:sz w:val="16"/>
-                <w:szCs w:val="16"/>
-              </w:rPr>
-              <w:t>?</w:t>
+              <w:t>¿Funciona con táblets?</w:t>
             </w:r>
           </w:p>
         </w:tc>
@@ -22492,19 +22388,11 @@
           <w:color w:val="FF0000"/>
         </w:rPr>
       </w:pPr>
-      <w:proofErr w:type="gramStart"/>
       <w:r>
         <w:rPr>
           <w:color w:val="FF0000"/>
         </w:rPr>
-        <w:t>Hacer….</w:t>
-      </w:r>
-      <w:proofErr w:type="gramEnd"/>
-      <w:r>
-        <w:rPr>
-          <w:color w:val="FF0000"/>
-        </w:rPr>
-        <w:t>.</w:t>
+        <w:t>Hacer…..</w:t>
       </w:r>
     </w:p>
     <w:p/>
@@ -22537,19 +22425,11 @@
           <w:color w:val="FF0000"/>
         </w:rPr>
       </w:pPr>
-      <w:proofErr w:type="gramStart"/>
       <w:r>
         <w:rPr>
           <w:color w:val="FF0000"/>
         </w:rPr>
-        <w:t>Hacer….</w:t>
-      </w:r>
-      <w:proofErr w:type="gramEnd"/>
-      <w:r>
-        <w:rPr>
-          <w:color w:val="FF0000"/>
-        </w:rPr>
-        <w:t>.</w:t>
+        <w:t>Hacer…..</w:t>
       </w:r>
     </w:p>
     <w:p/>
@@ -22561,16 +22441,11 @@
       <w:bookmarkStart w:id="165" w:name="_Toc182218992"/>
       <w:bookmarkStart w:id="166" w:name="_Toc182500170"/>
       <w:r>
-        <w:t xml:space="preserve">Implementación de la BBDD bajo </w:t>
-      </w:r>
-      <w:proofErr w:type="spellStart"/>
-      <w:r>
-        <w:t>Mysql</w:t>
+        <w:t>Implementación de la BBDD bajo Mysql</w:t>
       </w:r>
       <w:bookmarkEnd w:id="164"/>
       <w:bookmarkEnd w:id="165"/>
       <w:bookmarkEnd w:id="166"/>
-      <w:proofErr w:type="spellEnd"/>
     </w:p>
     <w:p>
       <w:pPr>
@@ -22584,19 +22459,11 @@
           <w:color w:val="FF0000"/>
         </w:rPr>
       </w:pPr>
-      <w:proofErr w:type="gramStart"/>
       <w:r>
         <w:rPr>
           <w:color w:val="FF0000"/>
         </w:rPr>
-        <w:t>Hacer….</w:t>
-      </w:r>
-      <w:proofErr w:type="gramEnd"/>
-      <w:r>
-        <w:rPr>
-          <w:color w:val="FF0000"/>
-        </w:rPr>
-        <w:t>.</w:t>
+        <w:t>Hacer…..</w:t>
       </w:r>
     </w:p>
     <w:p/>
@@ -22791,15 +22658,8 @@
           <w:b/>
         </w:rPr>
         <w:tab/>
-      </w:r>
-      <w:proofErr w:type="spellStart"/>
-      <w:r>
-        <w:rPr>
-          <w:b/>
-        </w:rPr>
         <w:t>Software</w:t>
       </w:r>
-      <w:proofErr w:type="spellEnd"/>
       <w:r>
         <w:rPr>
           <w:b/>
@@ -22874,20 +22734,12 @@
       </w:r>
       <w:r>
         <w:tab/>
-      </w:r>
-      <w:proofErr w:type="spellStart"/>
-      <w:r>
         <w:t>mañana</w:t>
       </w:r>
-      <w:proofErr w:type="spellEnd"/>
       <w:r>
         <w:tab/>
-      </w:r>
-      <w:proofErr w:type="spellStart"/>
-      <w:r>
         <w:t>mañana</w:t>
       </w:r>
-      <w:proofErr w:type="spellEnd"/>
       <w:r>
         <w:tab/>
         <w:t xml:space="preserve">noche </w:t>
@@ -22942,12 +22794,8 @@
       </w:r>
       <w:r>
         <w:tab/>
-      </w:r>
-      <w:proofErr w:type="spellStart"/>
-      <w:r>
         <w:t>Instalador</w:t>
       </w:r>
-      <w:proofErr w:type="spellEnd"/>
       <w:r>
         <w:tab/>
         <w:t>Usuario</w:t>
@@ -23039,19 +22887,11 @@
           <w:color w:val="FF0000"/>
         </w:rPr>
       </w:pPr>
-      <w:proofErr w:type="gramStart"/>
       <w:r>
         <w:rPr>
           <w:color w:val="FF0000"/>
         </w:rPr>
-        <w:t>Hacer….</w:t>
-      </w:r>
-      <w:proofErr w:type="gramEnd"/>
-      <w:r>
-        <w:rPr>
-          <w:color w:val="FF0000"/>
-        </w:rPr>
-        <w:t>.</w:t>
+        <w:t>Hacer…..</w:t>
       </w:r>
     </w:p>
     <w:p/>
@@ -23084,19 +22924,11 @@
         </w:rPr>
       </w:pPr>
       <w:bookmarkStart w:id="180" w:name="_Toc49341876"/>
-      <w:proofErr w:type="gramStart"/>
       <w:r>
         <w:rPr>
           <w:color w:val="FF0000"/>
         </w:rPr>
-        <w:t>Hacer….</w:t>
-      </w:r>
-      <w:proofErr w:type="gramEnd"/>
-      <w:r>
-        <w:rPr>
-          <w:color w:val="FF0000"/>
-        </w:rPr>
-        <w:t>.</w:t>
+        <w:t>Hacer…..</w:t>
       </w:r>
     </w:p>
     <w:p>
@@ -23124,19 +22956,11 @@
           <w:color w:val="FF0000"/>
         </w:rPr>
       </w:pPr>
-      <w:proofErr w:type="gramStart"/>
       <w:r>
         <w:rPr>
           <w:color w:val="FF0000"/>
         </w:rPr>
-        <w:t>Hacer….</w:t>
-      </w:r>
-      <w:proofErr w:type="gramEnd"/>
-      <w:r>
-        <w:rPr>
-          <w:color w:val="FF0000"/>
-        </w:rPr>
-        <w:t>.</w:t>
+        <w:t>Hacer…..</w:t>
       </w:r>
     </w:p>
     <w:p/>
@@ -23287,7 +23111,7 @@
                         </pic:cNvPicPr>
                       </pic:nvPicPr>
                       <pic:blipFill>
-                        <a:blip r:embed="rId32" cstate="print">
+                        <a:blip r:embed="rId34" cstate="print">
                           <a:extLst>
                             <a:ext uri="{28A0092B-C50C-407E-A947-70E740481C1C}">
                               <a14:useLocalDpi xmlns:a14="http://schemas.microsoft.com/office/drawing/2010/main" val="0"/>
@@ -23334,16 +23158,8 @@
               <w:b w:val="0"/>
             </w:rPr>
             <w:lastRenderedPageBreak/>
-            <w:t xml:space="preserve">Fichero exportado de </w:t>
+            <w:t>Fichero exportado de Delphos</w:t>
           </w:r>
-          <w:proofErr w:type="spellStart"/>
-          <w:r>
-            <w:rPr>
-              <w:b w:val="0"/>
-            </w:rPr>
-            <w:t>Delphos</w:t>
-          </w:r>
-          <w:proofErr w:type="spellEnd"/>
           <w:r>
             <w:rPr>
               <w:b w:val="0"/>
@@ -26419,19 +26235,11 @@
           <w:color w:val="FF0000"/>
         </w:rPr>
       </w:pPr>
-      <w:proofErr w:type="gramStart"/>
       <w:r>
         <w:rPr>
           <w:color w:val="FF0000"/>
         </w:rPr>
-        <w:t>Hacer….</w:t>
-      </w:r>
-      <w:proofErr w:type="gramEnd"/>
-      <w:r>
-        <w:rPr>
-          <w:color w:val="FF0000"/>
-        </w:rPr>
-        <w:t>.</w:t>
+        <w:t>Hacer…..</w:t>
       </w:r>
     </w:p>
     <w:p/>
@@ -33960,7 +33768,7 @@
   <w:style w:type="paragraph" w:default="1" w:styleId="Normal">
     <w:name w:val="Normal"/>
     <w:qFormat/>
-    <w:rsid w:val="00500DB0"/>
+    <w:rsid w:val="0067279D"/>
     <w:pPr>
       <w:spacing w:after="0"/>
       <w:jc w:val="both"/>
@@ -35490,6 +35298,7 @@
     <w:rsid w:val="00A71D6A"/>
     <w:rsid w:val="00A94268"/>
     <w:rsid w:val="00AC11EA"/>
+    <w:rsid w:val="00B17BB1"/>
     <w:rsid w:val="00B444FF"/>
     <w:rsid w:val="00BA03CE"/>
     <w:rsid w:val="00BB60B5"/>

</xml_diff>